<commit_message>
Docs: Library Guide for GitHub install and push steps
</commit_message>
<xml_diff>
--- a/docs/System-Guider-Library-Guide.docx
+++ b/docs/System-Guider-Library-Guide.docx
@@ -750,7 +750,7 @@
                 <w:sz w:val="17"/>
                 <w:szCs w:val="17"/>
               </w:rPr>
-              <w:t xml:space="preserve">npm install "file:C:/Users/PC/connected-devices/system-guider"</w:t>
+              <w:t xml:space="preserve">npm install "file:../system-guider"</w:t>
             </w:r>
           </w:p>
         </w:tc>
@@ -1113,7 +1113,7 @@
           <w:sz w:val="17"/>
           <w:szCs w:val="17"/>
         </w:rPr>
-        <w:t xml:space="preserve">cd C:\Users\PC\connected-devices\system-guider</w:t>
+        <w:t xml:space="preserve">cd C:\path\to\system-guider</w:t>
       </w:r>
     </w:p>
     <w:p>
@@ -1169,7 +1169,7 @@
           <w:sz w:val="21"/>
           <w:szCs w:val="21"/>
         </w:rPr>
-        <w:t xml:space="preserve">Install into the host app using a file: path:</w:t>
+        <w:t xml:space="preserve">Install into the host app using a relative file: path:</w:t>
       </w:r>
     </w:p>
     <w:p>
@@ -1206,7 +1206,7 @@
           <w:sz w:val="17"/>
           <w:szCs w:val="17"/>
         </w:rPr>
-        <w:t xml:space="preserve">npm install "file:C:/Users/PC/connected-devices/system-guider"</w:t>
+        <w:t xml:space="preserve">npm install "file:../system-guider"</w:t>
       </w:r>
     </w:p>
     <w:p>
@@ -1230,7 +1230,7 @@
           <w:sz w:val="20"/>
           <w:szCs w:val="20"/>
         </w:rPr>
-        <w:t xml:space="preserve">Use forward slashes in the file: path on Windows. After you change the library, run npm run build in system-guider, then reinstall or npm update in the host if needed.</w:t>
+        <w:t xml:space="preserve">Use a relative file: path when the library sits next to the host app. After you change the library, run npm run build in system-guider, then reinstall in the host if needed.</w:t>
       </w:r>
     </w:p>
     <w:p>
@@ -6899,7 +6899,7 @@
           <w:sz w:val="17"/>
           <w:szCs w:val="17"/>
         </w:rPr>
-        <w:t xml:space="preserve">cd C:\Users\PC\connected-devices\system-guider</w:t>
+        <w:t xml:space="preserve">cd C:\path\to\system-guider</w:t>
       </w:r>
     </w:p>
     <w:p>
@@ -7045,7 +7045,7 @@
           <w:sz w:val="21"/>
           <w:szCs w:val="21"/>
         </w:rPr>
-        <w:t xml:space="preserve">Stage and commit (IMPORTANT — do this before push):</w:t>
+        <w:t xml:space="preserve">If a nested empty clone folder exists (system-guider\system-guider), remove it first:</w:t>
       </w:r>
     </w:p>
     <w:p>
@@ -7066,39 +7066,7 @@
           <w:sz w:val="17"/>
           <w:szCs w:val="17"/>
         </w:rPr>
-        <w:t xml:space="preserve">git add .</w:t>
-      </w:r>
-    </w:p>
-    <w:p>
-      <w:pPr>
-        <w:shd w:fill="F8FAFC"/>
-        <w:spacing w:after="0" w:before="0"/>
-        <w:ind w:left="120"/>
-      </w:pPr>
-      <w:r>
-        <w:rPr>
-          <w:rFonts w:ascii="Consolas" w:cs="Consolas" w:eastAsia="Consolas" w:hAnsi="Consolas"/>
-          <w:color w:val="0F172A"/>
-          <w:sz w:val="17"/>
-          <w:szCs w:val="17"/>
-        </w:rPr>
-        <w:t xml:space="preserve">git status</w:t>
-      </w:r>
-    </w:p>
-    <w:p>
-      <w:pPr>
-        <w:shd w:fill="F8FAFC"/>
-        <w:spacing w:after="0" w:before="0"/>
-        <w:ind w:left="120"/>
-      </w:pPr>
-      <w:r>
-        <w:rPr>
-          <w:rFonts w:ascii="Consolas" w:cs="Consolas" w:eastAsia="Consolas" w:hAnsi="Consolas"/>
-          <w:color w:val="0F172A"/>
-          <w:sz w:val="17"/>
-          <w:szCs w:val="17"/>
-        </w:rPr>
-        <w:t xml:space="preserve">git commit -m "Initial commit: System Guider library"</w:t>
+        <w:t xml:space="preserve">rmdir /s /q system-guider</w:t>
       </w:r>
     </w:p>
     <w:p>
@@ -7122,7 +7090,7 @@
           <w:sz w:val="21"/>
           <w:szCs w:val="21"/>
         </w:rPr>
-        <w:t xml:space="preserve">Add the GitHub remote (use your username/repo):</w:t>
+        <w:t xml:space="preserve">Stage and commit (IMPORTANT — do this before push):</w:t>
       </w:r>
     </w:p>
     <w:p>
@@ -7143,39 +7111,39 @@
           <w:sz w:val="17"/>
           <w:szCs w:val="17"/>
         </w:rPr>
-        <w:t xml:space="preserve">git remote add origin https://github.com/jaimarbacs-prog/system-guider.git</w:t>
-      </w:r>
-    </w:p>
-    <w:p>
-      <w:pPr>
-        <w:shd w:fill="F8FAFC"/>
-        <w:spacing w:after="0" w:before="0"/>
-        <w:ind w:left="120"/>
-      </w:pPr>
-      <w:r>
-        <w:rPr>
-          <w:rFonts w:ascii="Consolas" w:cs="Consolas" w:eastAsia="Consolas" w:hAnsi="Consolas"/>
-          <w:color w:val="0F172A"/>
-          <w:sz w:val="17"/>
-          <w:szCs w:val="17"/>
-        </w:rPr>
-        <w:t xml:space="preserve"># If remote already exists:</w:t>
-      </w:r>
-    </w:p>
-    <w:p>
-      <w:pPr>
-        <w:shd w:fill="F8FAFC"/>
-        <w:spacing w:after="0" w:before="0"/>
-        <w:ind w:left="120"/>
-      </w:pPr>
-      <w:r>
-        <w:rPr>
-          <w:rFonts w:ascii="Consolas" w:cs="Consolas" w:eastAsia="Consolas" w:hAnsi="Consolas"/>
-          <w:color w:val="0F172A"/>
-          <w:sz w:val="17"/>
-          <w:szCs w:val="17"/>
-        </w:rPr>
-        <w:t xml:space="preserve"># git remote set-url origin https://github.com/jaimarbacs-prog/system-guider.git</w:t>
+        <w:t xml:space="preserve">git add .</w:t>
+      </w:r>
+    </w:p>
+    <w:p>
+      <w:pPr>
+        <w:shd w:fill="F8FAFC"/>
+        <w:spacing w:after="0" w:before="0"/>
+        <w:ind w:left="120"/>
+      </w:pPr>
+      <w:r>
+        <w:rPr>
+          <w:rFonts w:ascii="Consolas" w:cs="Consolas" w:eastAsia="Consolas" w:hAnsi="Consolas"/>
+          <w:color w:val="0F172A"/>
+          <w:sz w:val="17"/>
+          <w:szCs w:val="17"/>
+        </w:rPr>
+        <w:t xml:space="preserve">git status</w:t>
+      </w:r>
+    </w:p>
+    <w:p>
+      <w:pPr>
+        <w:shd w:fill="F8FAFC"/>
+        <w:spacing w:after="0" w:before="0"/>
+        <w:ind w:left="120"/>
+      </w:pPr>
+      <w:r>
+        <w:rPr>
+          <w:rFonts w:ascii="Consolas" w:cs="Consolas" w:eastAsia="Consolas" w:hAnsi="Consolas"/>
+          <w:color w:val="0F172A"/>
+          <w:sz w:val="17"/>
+          <w:szCs w:val="17"/>
+        </w:rPr>
+        <w:t xml:space="preserve">git commit -m "Initial commit: System Guider library"</w:t>
       </w:r>
     </w:p>
     <w:p>
@@ -7199,6 +7167,83 @@
           <w:sz w:val="21"/>
           <w:szCs w:val="21"/>
         </w:rPr>
+        <w:t xml:space="preserve">Add the GitHub remote (use your username/repo):</w:t>
+      </w:r>
+    </w:p>
+    <w:p>
+      <w:pPr>
+        <w:spacing w:before="100"/>
+      </w:pPr>
+    </w:p>
+    <w:p>
+      <w:pPr>
+        <w:shd w:fill="F8FAFC"/>
+        <w:spacing w:after="0" w:before="0"/>
+        <w:ind w:left="120"/>
+      </w:pPr>
+      <w:r>
+        <w:rPr>
+          <w:rFonts w:ascii="Consolas" w:cs="Consolas" w:eastAsia="Consolas" w:hAnsi="Consolas"/>
+          <w:color w:val="0F172A"/>
+          <w:sz w:val="17"/>
+          <w:szCs w:val="17"/>
+        </w:rPr>
+        <w:t xml:space="preserve">git remote add origin https://github.com/jaimarbacs-prog/system-guider.git</w:t>
+      </w:r>
+    </w:p>
+    <w:p>
+      <w:pPr>
+        <w:shd w:fill="F8FAFC"/>
+        <w:spacing w:after="0" w:before="0"/>
+        <w:ind w:left="120"/>
+      </w:pPr>
+      <w:r>
+        <w:rPr>
+          <w:rFonts w:ascii="Consolas" w:cs="Consolas" w:eastAsia="Consolas" w:hAnsi="Consolas"/>
+          <w:color w:val="0F172A"/>
+          <w:sz w:val="17"/>
+          <w:szCs w:val="17"/>
+        </w:rPr>
+        <w:t xml:space="preserve"># If remote already exists:</w:t>
+      </w:r>
+    </w:p>
+    <w:p>
+      <w:pPr>
+        <w:shd w:fill="F8FAFC"/>
+        <w:spacing w:after="0" w:before="0"/>
+        <w:ind w:left="120"/>
+      </w:pPr>
+      <w:r>
+        <w:rPr>
+          <w:rFonts w:ascii="Consolas" w:cs="Consolas" w:eastAsia="Consolas" w:hAnsi="Consolas"/>
+          <w:color w:val="0F172A"/>
+          <w:sz w:val="17"/>
+          <w:szCs w:val="17"/>
+        </w:rPr>
+        <w:t xml:space="preserve"># git remote set-url origin https://github.com/jaimarbacs-prog/system-guider.git</w:t>
+      </w:r>
+    </w:p>
+    <w:p>
+      <w:pPr>
+        <w:spacing w:after="140"/>
+      </w:pPr>
+    </w:p>
+    <w:p>
+      <w:pPr>
+        <w:pStyle w:val="ListParagraph"/>
+        <w:numPr>
+          <w:ilvl w:val="0"/>
+          <w:numId w:val="3"/>
+        </w:numPr>
+        <w:spacing w:after="56"/>
+      </w:pPr>
+      <w:r>
+        <w:rPr>
+          <w:rFonts w:ascii="Calibri" w:cs="Calibri" w:eastAsia="Calibri" w:hAnsi="Calibri"/>
+          <w:color w:val="0F172A"/>
+          <w:sz w:val="21"/>
+          <w:szCs w:val="21"/>
+        </w:rPr>
         <w:t xml:space="preserve">Push:</w:t>
       </w:r>
     </w:p>
@@ -7244,7 +7289,7 @@
           <w:sz w:val="20"/>
           <w:szCs w:val="20"/>
         </w:rPr>
-        <w:t xml:space="preserve">Error "src refspec main does not match any" means there is no commit yet. Run git add . and git commit first, then push again.</w:t>
+        <w:t xml:space="preserve">Error "src refspec main does not match any" means there is no commit yet. Run git add . and git commit first, then push again. Error "system-guider/ does not have a commit checked out" means a nested empty clone folder exists — delete it, then git add again.</w:t>
       </w:r>
     </w:p>
     <w:p>
@@ -7282,7 +7327,7 @@
           <w:sz w:val="17"/>
           <w:szCs w:val="17"/>
         </w:rPr>
-        <w:t xml:space="preserve">cd C:\Users\PC\connected-devices\system-guider</w:t>
+        <w:t xml:space="preserve">cd C:\path\to\system-guider</w:t>
       </w:r>
     </w:p>
     <w:p>

</xml_diff>

<commit_message>
Docs: restore clear scoring weights section in Library Guide
</commit_message>
<xml_diff>
--- a/docs/System-Guider-Library-Guide.docx
+++ b/docs/System-Guider-Library-Guide.docx
@@ -5673,7 +5673,7 @@
           <w:sz w:val="28"/>
           <w:szCs w:val="28"/>
         </w:rPr>
-        <w:t xml:space="preserve">8. Scoring engine</w:t>
+        <w:t xml:space="preserve">8. Scoring (resilient targeting)</w:t>
       </w:r>
     </w:p>
     <w:p>
@@ -5691,7 +5691,7 @@
           <w:sz w:val="21"/>
           <w:szCs w:val="21"/>
         </w:rPr>
-        <w:t xml:space="preserve">During recording, System Guider stores a CSS selector plus optional match hints captured from the target (label text, href, section, id, and similar). During playback, candidates are ranked by scoreElement(match).</w:t>
+        <w:t xml:space="preserve">When a CSS selector breaks (layout or account differences), System Guider uses match hints captured at record time and scores candidate DOM elements to find the best target.</w:t>
       </w:r>
     </w:p>
     <w:p>
@@ -5710,7 +5710,7 @@
           <w:sz w:val="20"/>
           <w:szCs w:val="20"/>
         </w:rPr>
-        <w:t xml:space="preserve">data-guider is optional. Guides work without it: the library still records match hints and uses scoring to find the best element. Adding data-guider is recommended for maximum stability when labels or layout change.</w:t>
+        <w:t xml:space="preserve">data-guider is optional. Guides work without it: the library still records match hints and uses scoring. Adding data-guider is recommended for maximum stability when labels or layout change.</w:t>
       </w:r>
     </w:p>
     <w:p>
@@ -5746,7 +5746,7 @@
           <w:sz w:val="21"/>
           <w:szCs w:val="21"/>
         </w:rPr>
-        <w:t xml:space="preserve">dataGuider — optional stable hook via data-guider="…" (highest weight when present)</w:t>
+        <w:t xml:space="preserve">dataGuider — strongest when present; add data-guider="…" on important controls (optional)</w:t>
       </w:r>
     </w:p>
     <w:p>
@@ -5765,7 +5765,7 @@
           <w:sz w:val="21"/>
           <w:szCs w:val="21"/>
         </w:rPr>
-        <w:t xml:space="preserve">Always useful without hooks: text, href, section, id, name, placeholder, ariaLabel, role, tag, type</w:t>
+        <w:t xml:space="preserve">id, text / visible label, href, section (sidebar group), name, placeholder, role, tag, type</w:t>
       </w:r>
     </w:p>
     <w:p>
@@ -5782,7 +5782,7 @@
           <w:sz w:val="24"/>
           <w:szCs w:val="24"/>
         </w:rPr>
-        <w:t xml:space="preserve">8.2 Weight summary</w:t>
+        <w:t xml:space="preserve">8.2 Score weights (approximate)</w:t>
       </w:r>
     </w:p>
     <w:tbl>
@@ -5860,7 +5860,7 @@
                 <w:sz w:val="19"/>
                 <w:szCs w:val="19"/>
               </w:rPr>
-              <w:t xml:space="preserve">Typical weight</w:t>
+              <w:t xml:space="preserve">Score impact</w:t>
             </w:r>
           </w:p>
         </w:tc>
@@ -5892,7 +5892,7 @@
                 <w:sz w:val="19"/>
                 <w:szCs w:val="19"/>
               </w:rPr>
-              <w:t xml:space="preserve">data-guider exact</w:t>
+              <w:t xml:space="preserve">data-guider exact match</w:t>
             </w:r>
           </w:p>
         </w:tc>
@@ -5922,7 +5922,7 @@
                 <w:sz w:val="17"/>
                 <w:szCs w:val="17"/>
               </w:rPr>
-              <w:t xml:space="preserve">+100 (wrong hook −40) — only if you added the attribute</w:t>
+              <w:t xml:space="preserve">+100 (mismatch −40)</w:t>
             </w:r>
           </w:p>
         </w:tc>
@@ -5954,7 +5954,7 @@
                 <w:sz w:val="19"/>
                 <w:szCs w:val="19"/>
               </w:rPr>
-              <w:t xml:space="preserve">id exact</w:t>
+              <w:t xml:space="preserve">element id exact</w:t>
             </w:r>
           </w:p>
         </w:tc>
@@ -6016,7 +6016,7 @@
                 <w:sz w:val="17"/>
                 <w:szCs w:val="17"/>
               </w:rPr>
-              <w:t xml:space="preserve">href exact / suffix / partial</w:t>
+              <w:t xml:space="preserve">href exact / partial</w:t>
             </w:r>
           </w:p>
         </w:tc>
@@ -6046,7 +6046,7 @@
                 <w:sz w:val="17"/>
                 <w:szCs w:val="17"/>
               </w:rPr>
-              <w:t xml:space="preserve">+45 / +28 / +12</w:t>
+              <w:t xml:space="preserve">+45 / +28 / +12 (mismatch −25)</w:t>
             </w:r>
           </w:p>
         </w:tc>
@@ -6108,7 +6108,7 @@
                 <w:sz w:val="17"/>
                 <w:szCs w:val="17"/>
               </w:rPr>
-              <w:t xml:space="preserve">+50 / +40</w:t>
+              <w:t xml:space="preserve">+50 / +40 (weaker partials lower)</w:t>
             </w:r>
           </w:p>
         </w:tc>
@@ -6163,38 +6163,6 @@
           <w:p>
             <w:r>
               <w:rPr>
-                <w:rFonts w:ascii="Calibri" w:cs="Calibri" w:eastAsia="Calibri" w:hAnsi="Calibri"/>
-                <w:b w:val="false"/>
-                <w:bCs w:val="false"/>
-                <w:color w:val="0F172A"/>
-                <w:sz w:val="19"/>
-                <w:szCs w:val="19"/>
-              </w:rPr>
-              <w:t xml:space="preserve">+30</w:t>
-            </w:r>
-          </w:p>
-        </w:tc>
-      </w:tr>
-      <w:tr>
-        <w:tc>
-          <w:tcPr>
-            <w:tcW w:type="dxa" w:w="3600"/>
-            <w:tcBorders>
-              <w:top w:val="single" w:color="E2E8F0" w:sz="4"/>
-              <w:left w:val="single" w:color="E2E8F0" w:sz="4"/>
-              <w:bottom w:val="single" w:color="E2E8F0" w:sz="4"/>
-              <w:right w:val="single" w:color="E2E8F0" w:sz="4"/>
-            </w:tcBorders>
-            <w:tcMar>
-              <w:top w:type="dxa" w:w="60"/>
-              <w:left w:type="dxa" w:w="80"/>
-              <w:bottom w:type="dxa" w:w="60"/>
-              <w:right w:type="dxa" w:w="80"/>
-            </w:tcMar>
-          </w:tcPr>
-          <w:p>
-            <w:r>
-              <w:rPr>
                 <w:rFonts w:ascii="Consolas" w:cs="Consolas" w:eastAsia="Consolas" w:hAnsi="Consolas"/>
                 <w:b w:val="false"/>
                 <w:bCs w:val="false"/>
@@ -6202,13 +6170,15 @@
                 <w:sz w:val="17"/>
                 <w:szCs w:val="17"/>
               </w:rPr>
-              <w:t xml:space="preserve">name / role / type / tag</w:t>
-            </w:r>
-          </w:p>
-        </w:tc>
-        <w:tc>
-          <w:tcPr>
-            <w:tcW w:type="dxa" w:w="5760"/>
+              <w:t xml:space="preserve">+30 / +12 (mismatch −20)</w:t>
+            </w:r>
+          </w:p>
+        </w:tc>
+      </w:tr>
+      <w:tr>
+        <w:tc>
+          <w:tcPr>
+            <w:tcW w:type="dxa" w:w="3600"/>
             <w:tcBorders>
               <w:top w:val="single" w:color="E2E8F0" w:sz="4"/>
               <w:left w:val="single" w:color="E2E8F0" w:sz="4"/>
@@ -6232,6 +6202,36 @@
                 <w:sz w:val="17"/>
                 <w:szCs w:val="17"/>
               </w:rPr>
+              <w:t xml:space="preserve">name / role / type / tag</w:t>
+            </w:r>
+          </w:p>
+        </w:tc>
+        <w:tc>
+          <w:tcPr>
+            <w:tcW w:type="dxa" w:w="5760"/>
+            <w:tcBorders>
+              <w:top w:val="single" w:color="E2E8F0" w:sz="4"/>
+              <w:left w:val="single" w:color="E2E8F0" w:sz="4"/>
+              <w:bottom w:val="single" w:color="E2E8F0" w:sz="4"/>
+              <w:right w:val="single" w:color="E2E8F0" w:sz="4"/>
+            </w:tcBorders>
+            <w:tcMar>
+              <w:top w:type="dxa" w:w="60"/>
+              <w:left w:type="dxa" w:w="80"/>
+              <w:bottom w:type="dxa" w:w="60"/>
+              <w:right w:type="dxa" w:w="80"/>
+            </w:tcMar>
+          </w:tcPr>
+          <w:p>
+            <w:r>
+              <w:rPr>
+                <w:rFonts w:ascii="Consolas" w:cs="Consolas" w:eastAsia="Consolas" w:hAnsi="Consolas"/>
+                <w:b w:val="false"/>
+                <w:bCs w:val="false"/>
+                <w:color w:val="0F172A"/>
+                <w:sz w:val="17"/>
+                <w:szCs w:val="17"/>
+              </w:rPr>
               <w:t xml:space="preserve">+25 / +6 / +6 / +4</w:t>
             </w:r>
           </w:p>
@@ -6257,7 +6257,7 @@
           <w:sz w:val="24"/>
           <w:szCs w:val="24"/>
         </w:rPr>
-        <w:t xml:space="preserve">8.3 With or without data-guider</w:t>
+        <w:t xml:space="preserve">8.3 Best practice</w:t>
       </w:r>
     </w:p>
     <w:p>
@@ -6275,7 +6275,7 @@
           <w:sz w:val="21"/>
           <w:szCs w:val="21"/>
         </w:rPr>
-        <w:t xml:space="preserve">Default path (no markup changes): record the flow as usual. Playback uses the saved selector first; if it fails or is weak, scoring compares candidates using the recorded hints (text, href, section, and so on).</w:t>
+        <w:t xml:space="preserve">Default: record without markup changes. Playback uses the CSS selector first; if it fails or is weak, scoring ranks candidates from the recorded hints.</w:t>
       </w:r>
     </w:p>
     <w:p>
@@ -6293,7 +6293,7 @@
           <w:sz w:val="21"/>
           <w:szCs w:val="21"/>
         </w:rPr>
-        <w:t xml:space="preserve">Hardened path (optional): mark critical controls so scoring prefers an exact hook even when copy or DOM structure changes:</w:t>
+        <w:t xml:space="preserve">Optional — prefer stable hooks on critical controls:</w:t>
       </w:r>
     </w:p>
     <w:p>
@@ -6314,7 +6314,7 @@
           <w:sz w:val="17"/>
           <w:szCs w:val="17"/>
         </w:rPr>
-        <w:t xml:space="preserve">&lt;!-- Optional — not required for recording/playback --&gt;</w:t>
+        <w:t xml:space="preserve">&lt;!-- Prefer stable hooks (optional) --&gt;</w:t>
       </w:r>
     </w:p>
     <w:p>

</xml_diff>

<commit_message>
Show demo orb and keep coachmark tip near highlights.
Co-authored-by: Cursor <cursoragent@cursor.com>
</commit_message>
<xml_diff>
--- a/docs/System-Guider-Library-Guide.docx
+++ b/docs/System-Guider-Library-Guide.docx
@@ -49,6 +49,69 @@
           <w:szCs w:val="18"/>
         </w:rPr>
         <w:t xml:space="preserve">Documentation v1.0.0  ·  JavaScript (ESM / UMD)  ·  TypeScript declarations included</w:t>
+      </w:r>
+    </w:p>
+    <w:p>
+      <w:pPr>
+        <w:spacing w:after="80" w:before="120"/>
+        <w:jc w:val="center"/>
+      </w:pPr>
+      <w:r>
+        <w:drawing>
+          <wp:inline distT="0" distB="0" distL="0" distR="0">
+            <wp:extent cx="5143500" cy="3219450"/>
+            <wp:effectExtent t="0" r="0" b="0" l="0"/>
+            <wp:docPr id="1" name="highlight-tip" descr="Spotlight on the target with coachmark tip nearby" title="Playback highlight"/>
+            <wp:cNvGraphicFramePr>
+              <a:graphicFrameLocks xmlns:a="http://schemas.openxmlformats.org/drawingml/2006/main" noChangeAspect="1"/>
+            </wp:cNvGraphicFramePr>
+            <a:graphic xmlns:a="http://schemas.openxmlformats.org/drawingml/2006/main">
+              <a:graphicData uri="http://schemas.openxmlformats.org/drawingml/2006/picture">
+                <pic:pic xmlns:pic="http://schemas.openxmlformats.org/drawingml/2006/picture">
+                  <pic:nvPicPr>
+                    <pic:cNvPr id="0" name="" descr=""/>
+                    <pic:cNvPicPr>
+                      <a:picLocks noChangeAspect="1" noChangeArrowheads="1"/>
+                    </pic:cNvPicPr>
+                  </pic:nvPicPr>
+                  <pic:blipFill>
+                    <a:blip r:embed="rId9" cstate="none"/>
+                    <a:srcRect/>
+                    <a:stretch>
+                      <a:fillRect/>
+                    </a:stretch>
+                  </pic:blipFill>
+                  <pic:spPr bwMode="auto">
+                    <a:xfrm>
+                      <a:off x="0" y="0"/>
+                      <a:ext cx="5143500" cy="3219450"/>
+                    </a:xfrm>
+                    <a:prstGeom prst="rect">
+                      <a:avLst/>
+                    </a:prstGeom>
+                  </pic:spPr>
+                </pic:pic>
+              </a:graphicData>
+            </a:graphic>
+          </wp:inline>
+        </w:drawing>
+      </w:r>
+    </w:p>
+    <w:p>
+      <w:pPr>
+        <w:spacing w:after="200"/>
+        <w:jc w:val="center"/>
+      </w:pPr>
+      <w:r>
+        <w:rPr>
+          <w:rFonts w:ascii="Calibri" w:cs="Calibri" w:eastAsia="Calibri" w:hAnsi="Calibri"/>
+          <w:i/>
+          <w:iCs/>
+          <w:color w:val="475569"/>
+          <w:sz w:val="18"/>
+          <w:szCs w:val="18"/>
+        </w:rPr>
+        <w:t xml:space="preserve">Playback highlight: spotlight on the target, coachmark tip beside it with step progress, End Tutorial, and Skip Step.</w:t>
       </w:r>
     </w:p>
     <w:p>
@@ -506,7 +569,7 @@
                 <w:sz w:val="19"/>
                 <w:szCs w:val="19"/>
               </w:rPr>
-              <w:t xml:space="preserve">GitHub</w:t>
+              <w:t xml:space="preserve">npm registry</w:t>
             </w:r>
           </w:p>
         </w:tc>
@@ -536,7 +599,99 @@
                 <w:sz w:val="19"/>
                 <w:szCs w:val="19"/>
               </w:rPr>
-              <w:t xml:space="preserve">Library is on GitHub</w:t>
+              <w:t xml:space="preserve">Recommended — package published to npm</w:t>
+            </w:r>
+          </w:p>
+        </w:tc>
+        <w:tc>
+          <w:tcPr>
+            <w:tcW w:type="dxa" w:w="4760"/>
+            <w:tcBorders>
+              <w:top w:val="single" w:color="E2E8F0" w:sz="4"/>
+              <w:left w:val="single" w:color="E2E8F0" w:sz="4"/>
+              <w:bottom w:val="single" w:color="E2E8F0" w:sz="4"/>
+              <w:right w:val="single" w:color="E2E8F0" w:sz="4"/>
+            </w:tcBorders>
+            <w:tcMar>
+              <w:top w:type="dxa" w:w="60"/>
+              <w:left w:type="dxa" w:w="80"/>
+              <w:bottom w:type="dxa" w:w="60"/>
+              <w:right w:type="dxa" w:w="80"/>
+            </w:tcMar>
+          </w:tcPr>
+          <w:p>
+            <w:r>
+              <w:rPr>
+                <w:rFonts w:ascii="Calibri" w:cs="Calibri" w:eastAsia="Calibri" w:hAnsi="Calibri"/>
+                <w:b w:val="false"/>
+                <w:bCs w:val="false"/>
+                <w:color w:val="0F172A"/>
+                <w:sz w:val="19"/>
+                <w:szCs w:val="19"/>
+              </w:rPr>
+              <w:t xml:space="preserve">npm install system-guider</w:t>
+            </w:r>
+          </w:p>
+        </w:tc>
+      </w:tr>
+      <w:tr>
+        <w:tc>
+          <w:tcPr>
+            <w:tcW w:type="dxa" w:w="1800"/>
+            <w:tcBorders>
+              <w:top w:val="single" w:color="E2E8F0" w:sz="4"/>
+              <w:left w:val="single" w:color="E2E8F0" w:sz="4"/>
+              <w:bottom w:val="single" w:color="E2E8F0" w:sz="4"/>
+              <w:right w:val="single" w:color="E2E8F0" w:sz="4"/>
+            </w:tcBorders>
+            <w:tcMar>
+              <w:top w:type="dxa" w:w="60"/>
+              <w:left w:type="dxa" w:w="80"/>
+              <w:bottom w:type="dxa" w:w="60"/>
+              <w:right w:type="dxa" w:w="80"/>
+            </w:tcMar>
+          </w:tcPr>
+          <w:p>
+            <w:r>
+              <w:rPr>
+                <w:rFonts w:ascii="Calibri" w:cs="Calibri" w:eastAsia="Calibri" w:hAnsi="Calibri"/>
+                <w:b w:val="false"/>
+                <w:bCs w:val="false"/>
+                <w:color w:val="0F172A"/>
+                <w:sz w:val="19"/>
+                <w:szCs w:val="19"/>
+              </w:rPr>
+              <w:t xml:space="preserve">GitHub tag</w:t>
+            </w:r>
+          </w:p>
+        </w:tc>
+        <w:tc>
+          <w:tcPr>
+            <w:tcW w:type="dxa" w:w="2800"/>
+            <w:tcBorders>
+              <w:top w:val="single" w:color="E2E8F0" w:sz="4"/>
+              <w:left w:val="single" w:color="E2E8F0" w:sz="4"/>
+              <w:bottom w:val="single" w:color="E2E8F0" w:sz="4"/>
+              <w:right w:val="single" w:color="E2E8F0" w:sz="4"/>
+            </w:tcBorders>
+            <w:tcMar>
+              <w:top w:type="dxa" w:w="60"/>
+              <w:left w:type="dxa" w:w="80"/>
+              <w:bottom w:type="dxa" w:w="60"/>
+              <w:right w:type="dxa" w:w="80"/>
+            </w:tcMar>
+          </w:tcPr>
+          <w:p>
+            <w:r>
+              <w:rPr>
+                <w:rFonts w:ascii="Calibri" w:cs="Calibri" w:eastAsia="Calibri" w:hAnsi="Calibri"/>
+                <w:b w:val="false"/>
+                <w:bCs w:val="false"/>
+                <w:color w:val="0F172A"/>
+                <w:sz w:val="19"/>
+                <w:szCs w:val="19"/>
+              </w:rPr>
+              <w:t xml:space="preserve">Pin a release without npm</w:t>
             </w:r>
           </w:p>
         </w:tc>
@@ -566,7 +721,7 @@
                 <w:sz w:val="17"/>
                 <w:szCs w:val="17"/>
               </w:rPr>
-              <w:t xml:space="preserve">npm install github:jaimarbacs-prog/system-guider#main</w:t>
+              <w:t xml:space="preserve">npm install github:jaimarbacs-prog/system-guider#v1.0.0</w:t>
             </w:r>
           </w:p>
         </w:tc>
@@ -598,7 +753,7 @@
                 <w:sz w:val="19"/>
                 <w:szCs w:val="19"/>
               </w:rPr>
-              <w:t xml:space="preserve">GitHub tag</w:t>
+              <w:t xml:space="preserve">GitHub main</w:t>
             </w:r>
           </w:p>
         </w:tc>
@@ -628,7 +783,7 @@
                 <w:sz w:val="19"/>
                 <w:szCs w:val="19"/>
               </w:rPr>
-              <w:t xml:space="preserve">Pin a release</w:t>
+              <w:t xml:space="preserve">Track latest commit</w:t>
             </w:r>
           </w:p>
         </w:tc>
@@ -658,7 +813,7 @@
                 <w:sz w:val="17"/>
                 <w:szCs w:val="17"/>
               </w:rPr>
-              <w:t xml:space="preserve">npm install github:jaimarbacs-prog/system-guider#v1.0.0</w:t>
+              <w:t xml:space="preserve">npm install github:jaimarbacs-prog/system-guider#main</w:t>
             </w:r>
           </w:p>
         </w:tc>
@@ -755,98 +910,6 @@
           </w:p>
         </w:tc>
       </w:tr>
-      <w:tr>
-        <w:tc>
-          <w:tcPr>
-            <w:tcW w:type="dxa" w:w="1800"/>
-            <w:tcBorders>
-              <w:top w:val="single" w:color="E2E8F0" w:sz="4"/>
-              <w:left w:val="single" w:color="E2E8F0" w:sz="4"/>
-              <w:bottom w:val="single" w:color="E2E8F0" w:sz="4"/>
-              <w:right w:val="single" w:color="E2E8F0" w:sz="4"/>
-            </w:tcBorders>
-            <w:tcMar>
-              <w:top w:type="dxa" w:w="60"/>
-              <w:left w:type="dxa" w:w="80"/>
-              <w:bottom w:type="dxa" w:w="60"/>
-              <w:right w:type="dxa" w:w="80"/>
-            </w:tcMar>
-          </w:tcPr>
-          <w:p>
-            <w:r>
-              <w:rPr>
-                <w:rFonts w:ascii="Calibri" w:cs="Calibri" w:eastAsia="Calibri" w:hAnsi="Calibri"/>
-                <w:b w:val="false"/>
-                <w:bCs w:val="false"/>
-                <w:color w:val="0F172A"/>
-                <w:sz w:val="19"/>
-                <w:szCs w:val="19"/>
-              </w:rPr>
-              <w:t xml:space="preserve">npm registry</w:t>
-            </w:r>
-          </w:p>
-        </w:tc>
-        <w:tc>
-          <w:tcPr>
-            <w:tcW w:type="dxa" w:w="2800"/>
-            <w:tcBorders>
-              <w:top w:val="single" w:color="E2E8F0" w:sz="4"/>
-              <w:left w:val="single" w:color="E2E8F0" w:sz="4"/>
-              <w:bottom w:val="single" w:color="E2E8F0" w:sz="4"/>
-              <w:right w:val="single" w:color="E2E8F0" w:sz="4"/>
-            </w:tcBorders>
-            <w:tcMar>
-              <w:top w:type="dxa" w:w="60"/>
-              <w:left w:type="dxa" w:w="80"/>
-              <w:bottom w:type="dxa" w:w="60"/>
-              <w:right w:type="dxa" w:w="80"/>
-            </w:tcMar>
-          </w:tcPr>
-          <w:p>
-            <w:r>
-              <w:rPr>
-                <w:rFonts w:ascii="Calibri" w:cs="Calibri" w:eastAsia="Calibri" w:hAnsi="Calibri"/>
-                <w:b w:val="false"/>
-                <w:bCs w:val="false"/>
-                <w:color w:val="0F172A"/>
-                <w:sz w:val="19"/>
-                <w:szCs w:val="19"/>
-              </w:rPr>
-              <w:t xml:space="preserve">Package published to npm</w:t>
-            </w:r>
-          </w:p>
-        </w:tc>
-        <w:tc>
-          <w:tcPr>
-            <w:tcW w:type="dxa" w:w="4760"/>
-            <w:tcBorders>
-              <w:top w:val="single" w:color="E2E8F0" w:sz="4"/>
-              <w:left w:val="single" w:color="E2E8F0" w:sz="4"/>
-              <w:bottom w:val="single" w:color="E2E8F0" w:sz="4"/>
-              <w:right w:val="single" w:color="E2E8F0" w:sz="4"/>
-            </w:tcBorders>
-            <w:tcMar>
-              <w:top w:type="dxa" w:w="60"/>
-              <w:left w:type="dxa" w:w="80"/>
-              <w:bottom w:type="dxa" w:w="60"/>
-              <w:right w:type="dxa" w:w="80"/>
-            </w:tcMar>
-          </w:tcPr>
-          <w:p>
-            <w:r>
-              <w:rPr>
-                <w:rFonts w:ascii="Calibri" w:cs="Calibri" w:eastAsia="Calibri" w:hAnsi="Calibri"/>
-                <w:b w:val="false"/>
-                <w:bCs w:val="false"/>
-                <w:color w:val="0F172A"/>
-                <w:sz w:val="19"/>
-                <w:szCs w:val="19"/>
-              </w:rPr>
-              <w:t xml:space="preserve">npm install system-guider</w:t>
-            </w:r>
-          </w:p>
-        </w:tc>
-      </w:tr>
     </w:tbl>
     <w:p>
       <w:pPr>
@@ -886,7 +949,7 @@
           <w:sz w:val="24"/>
           <w:szCs w:val="24"/>
         </w:rPr>
-        <w:t xml:space="preserve">2.3 Full example — install from GitHub</w:t>
+        <w:t xml:space="preserve">2.3 Full example — install from npm</w:t>
       </w:r>
     </w:p>
     <w:p>
@@ -969,7 +1032,7 @@
           <w:sz w:val="21"/>
           <w:szCs w:val="21"/>
         </w:rPr>
-        <w:t xml:space="preserve">Install System Guider from GitHub:</w:t>
+        <w:t xml:space="preserve">Install System Guider from the npm registry:</w:t>
       </w:r>
     </w:p>
     <w:p>
@@ -990,7 +1053,7 @@
           <w:sz w:val="17"/>
           <w:szCs w:val="17"/>
         </w:rPr>
-        <w:t xml:space="preserve">npm install github:jaimarbacs-prog/system-guider#main</w:t>
+        <w:t xml:space="preserve">npm install system-guider</w:t>
       </w:r>
     </w:p>
     <w:p>
@@ -1266,7 +1329,7 @@
           <w:sz w:val="21"/>
           <w:szCs w:val="21"/>
         </w:rPr>
-        <w:t xml:space="preserve">Create or edit a JS entry file that boots the guider, for example resources/js/system-guider-init.js:</w:t>
+        <w:t xml:space="preserve">Create or edit an init module that boots the guider (for example system-guider-init.js next to your JS entry):</w:t>
       </w:r>
     </w:p>
     <w:p>
@@ -1487,7 +1550,7 @@
           <w:sz w:val="21"/>
           <w:szCs w:val="21"/>
         </w:rPr>
-        <w:t xml:space="preserve">Import that file from your main app entry (for example resources/js/app.js):</w:t>
+        <w:t xml:space="preserve">Import that file from your JavaScript entry file (the file Vite/Webpack boots — e.g. resources/js/app.js, src/main.js, src/index.js):</w:t>
       </w:r>
     </w:p>
     <w:p>
@@ -1916,23 +1979,71 @@
           <w:sz w:val="17"/>
           <w:szCs w:val="17"/>
         </w:rPr>
-        <w:t xml:space="preserve"># Update from GitHub main</w:t>
-      </w:r>
-    </w:p>
-    <w:p>
-      <w:pPr>
-        <w:shd w:fill="F8FAFC"/>
-        <w:spacing w:after="0" w:before="0"/>
-        <w:ind w:left="120"/>
-      </w:pPr>
-      <w:r>
-        <w:rPr>
-          <w:rFonts w:ascii="Consolas" w:cs="Consolas" w:eastAsia="Consolas" w:hAnsi="Consolas"/>
-          <w:color w:val="0F172A"/>
-          <w:sz w:val="17"/>
-          <w:szCs w:val="17"/>
-        </w:rPr>
-        <w:t xml:space="preserve">npm install github:jaimarbacs-prog/system-guider#main</w:t>
+        <w:t xml:space="preserve"># Update from npm</w:t>
+      </w:r>
+    </w:p>
+    <w:p>
+      <w:pPr>
+        <w:shd w:fill="F8FAFC"/>
+        <w:spacing w:after="0" w:before="0"/>
+        <w:ind w:left="120"/>
+      </w:pPr>
+      <w:r>
+        <w:rPr>
+          <w:rFonts w:ascii="Consolas" w:cs="Consolas" w:eastAsia="Consolas" w:hAnsi="Consolas"/>
+          <w:color w:val="0F172A"/>
+          <w:sz w:val="17"/>
+          <w:szCs w:val="17"/>
+        </w:rPr>
+        <w:t xml:space="preserve">npm install system-guider@latest</w:t>
+      </w:r>
+    </w:p>
+    <w:p>
+      <w:pPr>
+        <w:shd w:fill="F8FAFC"/>
+        <w:spacing w:after="0" w:before="0"/>
+        <w:ind w:left="120"/>
+      </w:pPr>
+      <w:r>
+        <w:rPr>
+          <w:rFonts w:ascii="Consolas" w:cs="Consolas" w:eastAsia="Consolas" w:hAnsi="Consolas"/>
+          <w:color w:val="0F172A"/>
+          <w:sz w:val="17"/>
+          <w:szCs w:val="17"/>
+        </w:rPr>
+        <w:t xml:space="preserve"> </w:t>
+      </w:r>
+    </w:p>
+    <w:p>
+      <w:pPr>
+        <w:shd w:fill="F8FAFC"/>
+        <w:spacing w:after="0" w:before="0"/>
+        <w:ind w:left="120"/>
+      </w:pPr>
+      <w:r>
+        <w:rPr>
+          <w:rFonts w:ascii="Consolas" w:cs="Consolas" w:eastAsia="Consolas" w:hAnsi="Consolas"/>
+          <w:color w:val="0F172A"/>
+          <w:sz w:val="17"/>
+          <w:szCs w:val="17"/>
+        </w:rPr>
+        <w:t xml:space="preserve"># Or pin a GitHub tag</w:t>
+      </w:r>
+    </w:p>
+    <w:p>
+      <w:pPr>
+        <w:shd w:fill="F8FAFC"/>
+        <w:spacing w:after="0" w:before="0"/>
+        <w:ind w:left="120"/>
+      </w:pPr>
+      <w:r>
+        <w:rPr>
+          <w:rFonts w:ascii="Consolas" w:cs="Consolas" w:eastAsia="Consolas" w:hAnsi="Consolas"/>
+          <w:color w:val="0F172A"/>
+          <w:sz w:val="17"/>
+          <w:szCs w:val="17"/>
+        </w:rPr>
+        <w:t xml:space="preserve">npm install github:jaimarbacs-prog/system-guider#v1.0.0</w:t>
       </w:r>
     </w:p>
     <w:p>
@@ -4289,7 +4400,7 @@
           <w:sz w:val="21"/>
           <w:szCs w:val="21"/>
         </w:rPr>
-        <w:t xml:space="preserve">Wire whatever identity your stack already exposes (session, JWT claim, Inertia shared props, etc.). Keep the adapter thin and re-run it on client-side navigations.</w:t>
+        <w:t xml:space="preserve">Wire whatever identity your stack already exposes. Auth shapes differ per app — keep the adapter thin and re-run it on client-side navigations.</w:t>
       </w:r>
     </w:p>
     <w:p>
@@ -4310,39 +4421,135 @@
           <w:sz w:val="17"/>
           <w:szCs w:val="17"/>
         </w:rPr>
-        <w:t xml:space="preserve">function syncGuiderIdentity(guider, accountId) {</w:t>
-      </w:r>
-    </w:p>
-    <w:p>
-      <w:pPr>
-        <w:shd w:fill="F8FAFC"/>
-        <w:spacing w:after="0" w:before="0"/>
-        <w:ind w:left="120"/>
-      </w:pPr>
-      <w:r>
-        <w:rPr>
-          <w:rFonts w:ascii="Consolas" w:cs="Consolas" w:eastAsia="Consolas" w:hAnsi="Consolas"/>
-          <w:color w:val="0F172A"/>
-          <w:sz w:val="17"/>
-          <w:szCs w:val="17"/>
-        </w:rPr>
-        <w:t xml:space="preserve">  guider.setAccountId(accountId ?? null)</w:t>
-      </w:r>
-    </w:p>
-    <w:p>
-      <w:pPr>
-        <w:shd w:fill="F8FAFC"/>
-        <w:spacing w:after="0" w:before="0"/>
-        <w:ind w:left="120"/>
-      </w:pPr>
-      <w:r>
-        <w:rPr>
-          <w:rFonts w:ascii="Consolas" w:cs="Consolas" w:eastAsia="Consolas" w:hAnsi="Consolas"/>
-          <w:color w:val="0F172A"/>
-          <w:sz w:val="17"/>
-          <w:szCs w:val="17"/>
-        </w:rPr>
-        <w:t xml:space="preserve">  guider.applyAccessPolicy()</w:t>
+        <w:t xml:space="preserve">function syncGuiderAccountId(pageProps) {</w:t>
+      </w:r>
+    </w:p>
+    <w:p>
+      <w:pPr>
+        <w:shd w:fill="F8FAFC"/>
+        <w:spacing w:after="0" w:before="0"/>
+        <w:ind w:left="120"/>
+      </w:pPr>
+      <w:r>
+        <w:rPr>
+          <w:rFonts w:ascii="Consolas" w:cs="Consolas" w:eastAsia="Consolas" w:hAnsi="Consolas"/>
+          <w:color w:val="0F172A"/>
+          <w:sz w:val="17"/>
+          <w:szCs w:val="17"/>
+        </w:rPr>
+        <w:t xml:space="preserve">  // Map to YOUR shared props (examples):</w:t>
+      </w:r>
+    </w:p>
+    <w:p>
+      <w:pPr>
+        <w:shd w:fill="F8FAFC"/>
+        <w:spacing w:after="0" w:before="0"/>
+        <w:ind w:left="120"/>
+      </w:pPr>
+      <w:r>
+        <w:rPr>
+          <w:rFonts w:ascii="Consolas" w:cs="Consolas" w:eastAsia="Consolas" w:hAnsi="Consolas"/>
+          <w:color w:val="0F172A"/>
+          <w:sz w:val="17"/>
+          <w:szCs w:val="17"/>
+        </w:rPr>
+        <w:t xml:space="preserve">  //   pageProps?.auth?.user?.id</w:t>
+      </w:r>
+    </w:p>
+    <w:p>
+      <w:pPr>
+        <w:shd w:fill="F8FAFC"/>
+        <w:spacing w:after="0" w:before="0"/>
+        <w:ind w:left="120"/>
+      </w:pPr>
+      <w:r>
+        <w:rPr>
+          <w:rFonts w:ascii="Consolas" w:cs="Consolas" w:eastAsia="Consolas" w:hAnsi="Consolas"/>
+          <w:color w:val="0F172A"/>
+          <w:sz w:val="17"/>
+          <w:szCs w:val="17"/>
+        </w:rPr>
+        <w:t xml:space="preserve">  //   pageProps?.auth?.account?.id</w:t>
+      </w:r>
+    </w:p>
+    <w:p>
+      <w:pPr>
+        <w:shd w:fill="F8FAFC"/>
+        <w:spacing w:after="0" w:before="0"/>
+        <w:ind w:left="120"/>
+      </w:pPr>
+      <w:r>
+        <w:rPr>
+          <w:rFonts w:ascii="Consolas" w:cs="Consolas" w:eastAsia="Consolas" w:hAnsi="Consolas"/>
+          <w:color w:val="0F172A"/>
+          <w:sz w:val="17"/>
+          <w:szCs w:val="17"/>
+        </w:rPr>
+        <w:t xml:space="preserve">  //   pageProps?.user?.id</w:t>
+      </w:r>
+    </w:p>
+    <w:p>
+      <w:pPr>
+        <w:shd w:fill="F8FAFC"/>
+        <w:spacing w:after="0" w:before="0"/>
+        <w:ind w:left="120"/>
+      </w:pPr>
+      <w:r>
+        <w:rPr>
+          <w:rFonts w:ascii="Consolas" w:cs="Consolas" w:eastAsia="Consolas" w:hAnsi="Consolas"/>
+          <w:color w:val="0F172A"/>
+          <w:sz w:val="17"/>
+          <w:szCs w:val="17"/>
+        </w:rPr>
+        <w:t xml:space="preserve">  const accountId = pageProps?.auth?.user?.id ?? null</w:t>
+      </w:r>
+    </w:p>
+    <w:p>
+      <w:pPr>
+        <w:shd w:fill="F8FAFC"/>
+        <w:spacing w:after="0" w:before="0"/>
+        <w:ind w:left="120"/>
+      </w:pPr>
+      <w:r>
+        <w:rPr>
+          <w:rFonts w:ascii="Consolas" w:cs="Consolas" w:eastAsia="Consolas" w:hAnsi="Consolas"/>
+          <w:color w:val="0F172A"/>
+          <w:sz w:val="17"/>
+          <w:szCs w:val="17"/>
+        </w:rPr>
+        <w:t xml:space="preserve">  window.systemGuider?.setAccountId?.(</w:t>
+      </w:r>
+    </w:p>
+    <w:p>
+      <w:pPr>
+        <w:shd w:fill="F8FAFC"/>
+        <w:spacing w:after="0" w:before="0"/>
+        <w:ind w:left="120"/>
+      </w:pPr>
+      <w:r>
+        <w:rPr>
+          <w:rFonts w:ascii="Consolas" w:cs="Consolas" w:eastAsia="Consolas" w:hAnsi="Consolas"/>
+          <w:color w:val="0F172A"/>
+          <w:sz w:val="17"/>
+          <w:szCs w:val="17"/>
+        </w:rPr>
+        <w:t xml:space="preserve">    accountId == null || accountId === '' ? null : String(accountId),</w:t>
+      </w:r>
+    </w:p>
+    <w:p>
+      <w:pPr>
+        <w:shd w:fill="F8FAFC"/>
+        <w:spacing w:after="0" w:before="0"/>
+        <w:ind w:left="120"/>
+      </w:pPr>
+      <w:r>
+        <w:rPr>
+          <w:rFonts w:ascii="Consolas" w:cs="Consolas" w:eastAsia="Consolas" w:hAnsi="Consolas"/>
+          <w:color w:val="0F172A"/>
+          <w:sz w:val="17"/>
+          <w:szCs w:val="17"/>
+        </w:rPr>
+        <w:t xml:space="preserve">  )</w:t>
       </w:r>
     </w:p>
     <w:p>
@@ -4390,29 +4597,128 @@
           <w:sz w:val="17"/>
           <w:szCs w:val="17"/>
         </w:rPr>
-        <w:t xml:space="preserve">// Example — call after login and after SPA route changes</w:t>
-      </w:r>
-    </w:p>
-    <w:p>
-      <w:pPr>
-        <w:shd w:fill="F8FAFC"/>
-        <w:spacing w:after="0" w:before="0"/>
-        <w:ind w:left="120"/>
-      </w:pPr>
-      <w:r>
-        <w:rPr>
-          <w:rFonts w:ascii="Consolas" w:cs="Consolas" w:eastAsia="Consolas" w:hAnsi="Consolas"/>
-          <w:color w:val="0F172A"/>
-          <w:sz w:val="17"/>
-          <w:szCs w:val="17"/>
-        </w:rPr>
-        <w:t xml:space="preserve">syncGuiderIdentity(window.systemGuider, currentUser?.id)</w:t>
+        <w:t xml:space="preserve">// First load (Inertia setup)</w:t>
+      </w:r>
+    </w:p>
+    <w:p>
+      <w:pPr>
+        <w:shd w:fill="F8FAFC"/>
+        <w:spacing w:after="0" w:before="0"/>
+        <w:ind w:left="120"/>
+      </w:pPr>
+      <w:r>
+        <w:rPr>
+          <w:rFonts w:ascii="Consolas" w:cs="Consolas" w:eastAsia="Consolas" w:hAnsi="Consolas"/>
+          <w:color w:val="0F172A"/>
+          <w:sz w:val="17"/>
+          <w:szCs w:val="17"/>
+        </w:rPr>
+        <w:t xml:space="preserve">syncGuiderAccountId(props.initialPage?.props ?? props)</w:t>
+      </w:r>
+    </w:p>
+    <w:p>
+      <w:pPr>
+        <w:shd w:fill="F8FAFC"/>
+        <w:spacing w:after="0" w:before="0"/>
+        <w:ind w:left="120"/>
+      </w:pPr>
+      <w:r>
+        <w:rPr>
+          <w:rFonts w:ascii="Consolas" w:cs="Consolas" w:eastAsia="Consolas" w:hAnsi="Consolas"/>
+          <w:color w:val="0F172A"/>
+          <w:sz w:val="17"/>
+          <w:szCs w:val="17"/>
+        </w:rPr>
+        <w:t xml:space="preserve"> </w:t>
+      </w:r>
+    </w:p>
+    <w:p>
+      <w:pPr>
+        <w:shd w:fill="F8FAFC"/>
+        <w:spacing w:after="0" w:before="0"/>
+        <w:ind w:left="120"/>
+      </w:pPr>
+      <w:r>
+        <w:rPr>
+          <w:rFonts w:ascii="Consolas" w:cs="Consolas" w:eastAsia="Consolas" w:hAnsi="Consolas"/>
+          <w:color w:val="0F172A"/>
+          <w:sz w:val="17"/>
+          <w:szCs w:val="17"/>
+        </w:rPr>
+        <w:t xml:space="preserve">// Soft visits</w:t>
+      </w:r>
+    </w:p>
+    <w:p>
+      <w:pPr>
+        <w:shd w:fill="F8FAFC"/>
+        <w:spacing w:after="0" w:before="0"/>
+        <w:ind w:left="120"/>
+      </w:pPr>
+      <w:r>
+        <w:rPr>
+          <w:rFonts w:ascii="Consolas" w:cs="Consolas" w:eastAsia="Consolas" w:hAnsi="Consolas"/>
+          <w:color w:val="0F172A"/>
+          <w:sz w:val="17"/>
+          <w:szCs w:val="17"/>
+        </w:rPr>
+        <w:t xml:space="preserve">router.on('navigate', (event) =&gt; {</w:t>
+      </w:r>
+    </w:p>
+    <w:p>
+      <w:pPr>
+        <w:shd w:fill="F8FAFC"/>
+        <w:spacing w:after="0" w:before="0"/>
+        <w:ind w:left="120"/>
+      </w:pPr>
+      <w:r>
+        <w:rPr>
+          <w:rFonts w:ascii="Consolas" w:cs="Consolas" w:eastAsia="Consolas" w:hAnsi="Consolas"/>
+          <w:color w:val="0F172A"/>
+          <w:sz w:val="17"/>
+          <w:szCs w:val="17"/>
+        </w:rPr>
+        <w:t xml:space="preserve">  syncGuiderAccountId(event.detail.page.props)</w:t>
+      </w:r>
+    </w:p>
+    <w:p>
+      <w:pPr>
+        <w:shd w:fill="F8FAFC"/>
+        <w:spacing w:after="0" w:before="0"/>
+        <w:ind w:left="120"/>
+      </w:pPr>
+      <w:r>
+        <w:rPr>
+          <w:rFonts w:ascii="Consolas" w:cs="Consolas" w:eastAsia="Consolas" w:hAnsi="Consolas"/>
+          <w:color w:val="0F172A"/>
+          <w:sz w:val="17"/>
+          <w:szCs w:val="17"/>
+        </w:rPr>
+        <w:t xml:space="preserve">})</w:t>
       </w:r>
     </w:p>
     <w:p>
       <w:pPr>
         <w:spacing w:after="140"/>
       </w:pPr>
+    </w:p>
+    <w:p>
+      <w:pPr>
+        <w:pBdr>
+          <w:left w:val="single" w:color="1D4ED8" w:sz="24" w:space="8"/>
+        </w:pBdr>
+        <w:shd w:fill="EFF6FF"/>
+        <w:spacing w:after="140" w:before="80"/>
+        <w:ind w:left="120"/>
+      </w:pPr>
+      <w:r>
+        <w:rPr>
+          <w:rFonts w:ascii="Calibri" w:cs="Calibri" w:eastAsia="Calibri" w:hAnsi="Calibri"/>
+          <w:color w:val="1E3A8A"/>
+          <w:sz w:val="20"/>
+          <w:szCs w:val="20"/>
+        </w:rPr>
+        <w:t xml:space="preserve">setup uses props.initialPage.props; navigate uses event.detail.page.props — same auth payload, different Inertia object shapes. Do not replace your existing createInertiaApp body; only add these sync lines.</w:t>
+      </w:r>
     </w:p>
     <w:p>
       <w:pPr>
@@ -6330,23 +6636,23 @@
           <w:sz w:val="17"/>
           <w:szCs w:val="17"/>
         </w:rPr>
-        <w:t xml:space="preserve">&lt;button data-guider="save-timesheet"&gt;Save&lt;/button&gt;</w:t>
-      </w:r>
-    </w:p>
-    <w:p>
-      <w:pPr>
-        <w:shd w:fill="F8FAFC"/>
-        <w:spacing w:after="0" w:before="0"/>
-        <w:ind w:left="120"/>
-      </w:pPr>
-      <w:r>
-        <w:rPr>
-          <w:rFonts w:ascii="Consolas" w:cs="Consolas" w:eastAsia="Consolas" w:hAnsi="Consolas"/>
-          <w:color w:val="0F172A"/>
-          <w:sz w:val="17"/>
-          <w:szCs w:val="17"/>
-        </w:rPr>
-        <w:t xml:space="preserve">&lt;input data-guider="timesheet-date" type="date" /&gt;</w:t>
+        <w:t xml:space="preserve">&lt;button data-guider="save-profile"&gt;Save&lt;/button&gt;</w:t>
+      </w:r>
+    </w:p>
+    <w:p>
+      <w:pPr>
+        <w:shd w:fill="F8FAFC"/>
+        <w:spacing w:after="0" w:before="0"/>
+        <w:ind w:left="120"/>
+      </w:pPr>
+      <w:r>
+        <w:rPr>
+          <w:rFonts w:ascii="Consolas" w:cs="Consolas" w:eastAsia="Consolas" w:hAnsi="Consolas"/>
+          <w:color w:val="0F172A"/>
+          <w:sz w:val="17"/>
+          <w:szCs w:val="17"/>
+        </w:rPr>
+        <w:t xml:space="preserve">&lt;input data-guider="start-date" type="date" /&gt;</w:t>
       </w:r>
     </w:p>
     <w:p>
@@ -6674,7 +6980,7 @@
           <w:sz w:val="28"/>
           <w:szCs w:val="28"/>
         </w:rPr>
-        <w:t xml:space="preserve">11. Publish / push this library to GitHub (author tutorial)</w:t>
+        <w:t xml:space="preserve">11. Publish this library (author tutorial)</w:t>
       </w:r>
     </w:p>
     <w:p>
@@ -6692,7 +6998,7 @@
           <w:sz w:val="21"/>
           <w:szCs w:val="21"/>
         </w:rPr>
-        <w:t xml:space="preserve">These steps are for the library folder (system-guider), when YOU are uploading the package to GitHub so other projects can npm install it.</w:t>
+        <w:t xml:space="preserve">These steps are for the library folder (system-guider), when YOU are publishing so other projects can install it.</w:t>
       </w:r>
     </w:p>
     <w:p>
@@ -6709,7 +7015,7 @@
           <w:sz w:val="24"/>
           <w:szCs w:val="24"/>
         </w:rPr>
-        <w:t xml:space="preserve">11.1 Create an empty repo on GitHub</w:t>
+        <w:t xml:space="preserve">11.1 Recommended — publish to the npm registry</w:t>
       </w:r>
     </w:p>
     <w:p>
@@ -6728,7 +7034,7 @@
           <w:sz w:val="21"/>
           <w:szCs w:val="21"/>
         </w:rPr>
-        <w:t xml:space="preserve">Open https://github.com/new</w:t>
+        <w:t xml:space="preserve">Create an account at https://www.npmjs.com/signup (verify email).</w:t>
       </w:r>
     </w:p>
     <w:p>
@@ -6747,7 +7053,7 @@
           <w:sz w:val="21"/>
           <w:szCs w:val="21"/>
         </w:rPr>
-        <w:t xml:space="preserve">Repository name: system-guider</w:t>
+        <w:t xml:space="preserve">Enable Two-Factor Authentication under Account → Two-Factor Authentication (required to publish).</w:t>
       </w:r>
     </w:p>
     <w:p>
@@ -6766,8 +7072,50 @@
           <w:sz w:val="21"/>
           <w:szCs w:val="21"/>
         </w:rPr>
-        <w:t xml:space="preserve">Description (optional): Record and replay interactive UI guides.</w:t>
-      </w:r>
+        <w:t xml:space="preserve">In a terminal, go to the library folder and log in:</w:t>
+      </w:r>
+    </w:p>
+    <w:p>
+      <w:pPr>
+        <w:spacing w:before="100"/>
+      </w:pPr>
+    </w:p>
+    <w:p>
+      <w:pPr>
+        <w:shd w:fill="F8FAFC"/>
+        <w:spacing w:after="0" w:before="0"/>
+        <w:ind w:left="120"/>
+      </w:pPr>
+      <w:r>
+        <w:rPr>
+          <w:rFonts w:ascii="Consolas" w:cs="Consolas" w:eastAsia="Consolas" w:hAnsi="Consolas"/>
+          <w:color w:val="0F172A"/>
+          <w:sz w:val="17"/>
+          <w:szCs w:val="17"/>
+        </w:rPr>
+        <w:t xml:space="preserve">cd C:\path\to\system-guider</w:t>
+      </w:r>
+    </w:p>
+    <w:p>
+      <w:pPr>
+        <w:shd w:fill="F8FAFC"/>
+        <w:spacing w:after="0" w:before="0"/>
+        <w:ind w:left="120"/>
+      </w:pPr>
+      <w:r>
+        <w:rPr>
+          <w:rFonts w:ascii="Consolas" w:cs="Consolas" w:eastAsia="Consolas" w:hAnsi="Consolas"/>
+          <w:color w:val="0F172A"/>
+          <w:sz w:val="17"/>
+          <w:szCs w:val="17"/>
+        </w:rPr>
+        <w:t xml:space="preserve">npm login</w:t>
+      </w:r>
+    </w:p>
+    <w:p>
+      <w:pPr>
+        <w:spacing w:after="140"/>
+      </w:pPr>
     </w:p>
     <w:p>
       <w:pPr>
@@ -6785,8 +7133,34 @@
           <w:sz w:val="21"/>
           <w:szCs w:val="21"/>
         </w:rPr>
-        <w:t xml:space="preserve">Choose Public.</w:t>
-      </w:r>
+        <w:t xml:space="preserve">Build the library:</w:t>
+      </w:r>
+    </w:p>
+    <w:p>
+      <w:pPr>
+        <w:spacing w:before="100"/>
+      </w:pPr>
+    </w:p>
+    <w:p>
+      <w:pPr>
+        <w:shd w:fill="F8FAFC"/>
+        <w:spacing w:after="0" w:before="0"/>
+        <w:ind w:left="120"/>
+      </w:pPr>
+      <w:r>
+        <w:rPr>
+          <w:rFonts w:ascii="Consolas" w:cs="Consolas" w:eastAsia="Consolas" w:hAnsi="Consolas"/>
+          <w:color w:val="0F172A"/>
+          <w:sz w:val="17"/>
+          <w:szCs w:val="17"/>
+        </w:rPr>
+        <w:t xml:space="preserve">npm run build</w:t>
+      </w:r>
+    </w:p>
+    <w:p>
+      <w:pPr>
+        <w:spacing w:after="140"/>
+      </w:pPr>
     </w:p>
     <w:p>
       <w:pPr>
@@ -6804,8 +7178,34 @@
           <w:sz w:val="21"/>
           <w:szCs w:val="21"/>
         </w:rPr>
-        <w:t xml:space="preserve">Leave README / .gitignore / license OFF if the project already has those files locally.</w:t>
-      </w:r>
+        <w:t xml:space="preserve">Optional dry-run to confirm the tarball contents:</w:t>
+      </w:r>
+    </w:p>
+    <w:p>
+      <w:pPr>
+        <w:spacing w:before="100"/>
+      </w:pPr>
+    </w:p>
+    <w:p>
+      <w:pPr>
+        <w:shd w:fill="F8FAFC"/>
+        <w:spacing w:after="0" w:before="0"/>
+        <w:ind w:left="120"/>
+      </w:pPr>
+      <w:r>
+        <w:rPr>
+          <w:rFonts w:ascii="Consolas" w:cs="Consolas" w:eastAsia="Consolas" w:hAnsi="Consolas"/>
+          <w:color w:val="0F172A"/>
+          <w:sz w:val="17"/>
+          <w:szCs w:val="17"/>
+        </w:rPr>
+        <w:t xml:space="preserve">npm publish --dry-run</w:t>
+      </w:r>
+    </w:p>
+    <w:p>
+      <w:pPr>
+        <w:spacing w:after="140"/>
+      </w:pPr>
     </w:p>
     <w:p>
       <w:pPr>
@@ -6823,25 +7223,34 @@
           <w:sz w:val="21"/>
           <w:szCs w:val="21"/>
         </w:rPr>
-        <w:t xml:space="preserve">Click Create repository.</w:t>
-      </w:r>
-    </w:p>
-    <w:p>
-      <w:pPr>
-        <w:pStyle w:val="Heading2"/>
-        <w:spacing w:after="100" w:before="280"/>
-      </w:pPr>
-      <w:r>
-        <w:rPr>
-          <w:rFonts w:ascii="Calibri" w:cs="Calibri" w:eastAsia="Calibri" w:hAnsi="Calibri"/>
-          <w:b/>
-          <w:bCs/>
-          <w:color w:val="1D4ED8"/>
-          <w:sz w:val="24"/>
-          <w:szCs w:val="24"/>
-        </w:rPr>
-        <w:t xml:space="preserve">11.2 First-time push from your PC</w:t>
-      </w:r>
+        <w:t xml:space="preserve">Publish (public package):</w:t>
+      </w:r>
+    </w:p>
+    <w:p>
+      <w:pPr>
+        <w:spacing w:before="100"/>
+      </w:pPr>
+    </w:p>
+    <w:p>
+      <w:pPr>
+        <w:shd w:fill="F8FAFC"/>
+        <w:spacing w:after="0" w:before="0"/>
+        <w:ind w:left="120"/>
+      </w:pPr>
+      <w:r>
+        <w:rPr>
+          <w:rFonts w:ascii="Consolas" w:cs="Consolas" w:eastAsia="Consolas" w:hAnsi="Consolas"/>
+          <w:color w:val="0F172A"/>
+          <w:sz w:val="17"/>
+          <w:szCs w:val="17"/>
+        </w:rPr>
+        <w:t xml:space="preserve">npm publish --access public</w:t>
+      </w:r>
+    </w:p>
+    <w:p>
+      <w:pPr>
+        <w:spacing w:after="140"/>
+      </w:pPr>
     </w:p>
     <w:p>
       <w:pPr>
@@ -6859,7 +7268,88 @@
           <w:sz w:val="21"/>
           <w:szCs w:val="21"/>
         </w:rPr>
-        <w:t xml:space="preserve">Open Command Prompt or PowerShell.</w:t>
+        <w:t xml:space="preserve">Confirm it is live:</w:t>
+      </w:r>
+    </w:p>
+    <w:p>
+      <w:pPr>
+        <w:spacing w:before="100"/>
+      </w:pPr>
+    </w:p>
+    <w:p>
+      <w:pPr>
+        <w:shd w:fill="F8FAFC"/>
+        <w:spacing w:after="0" w:before="0"/>
+        <w:ind w:left="120"/>
+      </w:pPr>
+      <w:r>
+        <w:rPr>
+          <w:rFonts w:ascii="Consolas" w:cs="Consolas" w:eastAsia="Consolas" w:hAnsi="Consolas"/>
+          <w:color w:val="0F172A"/>
+          <w:sz w:val="17"/>
+          <w:szCs w:val="17"/>
+        </w:rPr>
+        <w:t xml:space="preserve">npm view system-guider</w:t>
+      </w:r>
+    </w:p>
+    <w:p>
+      <w:pPr>
+        <w:spacing w:after="140"/>
+      </w:pPr>
+    </w:p>
+    <w:p>
+      <w:pPr>
+        <w:pBdr>
+          <w:left w:val="single" w:color="1D4ED8" w:sz="24" w:space="8"/>
+        </w:pBdr>
+        <w:shd w:fill="EFF6FF"/>
+        <w:spacing w:after="140" w:before="80"/>
+        <w:ind w:left="120"/>
+      </w:pPr>
+      <w:r>
+        <w:rPr>
+          <w:rFonts w:ascii="Calibri" w:cs="Calibri" w:eastAsia="Calibri" w:hAnsi="Calibri"/>
+          <w:color w:val="1E3A8A"/>
+          <w:sz w:val="20"/>
+          <w:szCs w:val="20"/>
+        </w:rPr>
+        <w:t xml:space="preserve">E403 about two-factor authentication means enable 2FA on npm, then npm logout &amp;&amp; npm login, and publish again. Or create a granular access token with publish permission and 2FA bypass for automation.</w:t>
+      </w:r>
+    </w:p>
+    <w:p>
+      <w:pPr>
+        <w:pBdr>
+          <w:left w:val="single" w:color="1D4ED8" w:sz="24" w:space="8"/>
+        </w:pBdr>
+        <w:shd w:fill="EFF6FF"/>
+        <w:spacing w:after="140" w:before="80"/>
+        <w:ind w:left="120"/>
+      </w:pPr>
+      <w:r>
+        <w:rPr>
+          <w:rFonts w:ascii="Calibri" w:cs="Calibri" w:eastAsia="Calibri" w:hAnsi="Calibri"/>
+          <w:color w:val="1E3A8A"/>
+          <w:sz w:val="20"/>
+          <w:szCs w:val="20"/>
+        </w:rPr>
+        <w:t xml:space="preserve">Hosts then install with: npm install system-guider</w:t>
+      </w:r>
+    </w:p>
+    <w:p>
+      <w:pPr>
+        <w:pStyle w:val="Heading2"/>
+        <w:spacing w:after="100" w:before="280"/>
+      </w:pPr>
+      <w:r>
+        <w:rPr>
+          <w:rFonts w:ascii="Calibri" w:cs="Calibri" w:eastAsia="Calibri" w:hAnsi="Calibri"/>
+          <w:b/>
+          <w:bCs/>
+          <w:color w:val="1D4ED8"/>
+          <w:sz w:val="24"/>
+          <w:szCs w:val="24"/>
+        </w:rPr>
+        <w:t xml:space="preserve">11.2 Optional — push source to GitHub</w:t>
       </w:r>
     </w:p>
     <w:p>
@@ -6878,34 +7368,8 @@
           <w:sz w:val="21"/>
           <w:szCs w:val="21"/>
         </w:rPr>
-        <w:t xml:space="preserve">Go to the library folder:</w:t>
-      </w:r>
-    </w:p>
-    <w:p>
-      <w:pPr>
-        <w:spacing w:before="100"/>
-      </w:pPr>
-    </w:p>
-    <w:p>
-      <w:pPr>
-        <w:shd w:fill="F8FAFC"/>
-        <w:spacing w:after="0" w:before="0"/>
-        <w:ind w:left="120"/>
-      </w:pPr>
-      <w:r>
-        <w:rPr>
-          <w:rFonts w:ascii="Consolas" w:cs="Consolas" w:eastAsia="Consolas" w:hAnsi="Consolas"/>
-          <w:color w:val="0F172A"/>
-          <w:sz w:val="17"/>
-          <w:szCs w:val="17"/>
-        </w:rPr>
-        <w:t xml:space="preserve">cd C:\path\to\system-guider</w:t>
-      </w:r>
-    </w:p>
-    <w:p>
-      <w:pPr>
-        <w:spacing w:after="140"/>
-      </w:pPr>
+        <w:t xml:space="preserve">Open https://github.com/new</w:t>
+      </w:r>
     </w:p>
     <w:p>
       <w:pPr>
@@ -6923,50 +7387,8 @@
           <w:sz w:val="21"/>
           <w:szCs w:val="21"/>
         </w:rPr>
-        <w:t xml:space="preserve">Build before push (so dist/ is ready for consumers):</w:t>
-      </w:r>
-    </w:p>
-    <w:p>
-      <w:pPr>
-        <w:spacing w:before="100"/>
-      </w:pPr>
-    </w:p>
-    <w:p>
-      <w:pPr>
-        <w:shd w:fill="F8FAFC"/>
-        <w:spacing w:after="0" w:before="0"/>
-        <w:ind w:left="120"/>
-      </w:pPr>
-      <w:r>
-        <w:rPr>
-          <w:rFonts w:ascii="Consolas" w:cs="Consolas" w:eastAsia="Consolas" w:hAnsi="Consolas"/>
-          <w:color w:val="0F172A"/>
-          <w:sz w:val="17"/>
-          <w:szCs w:val="17"/>
-        </w:rPr>
-        <w:t xml:space="preserve">npm install</w:t>
-      </w:r>
-    </w:p>
-    <w:p>
-      <w:pPr>
-        <w:shd w:fill="F8FAFC"/>
-        <w:spacing w:after="0" w:before="0"/>
-        <w:ind w:left="120"/>
-      </w:pPr>
-      <w:r>
-        <w:rPr>
-          <w:rFonts w:ascii="Consolas" w:cs="Consolas" w:eastAsia="Consolas" w:hAnsi="Consolas"/>
-          <w:color w:val="0F172A"/>
-          <w:sz w:val="17"/>
-          <w:szCs w:val="17"/>
-        </w:rPr>
-        <w:t xml:space="preserve">npm run build</w:t>
-      </w:r>
-    </w:p>
-    <w:p>
-      <w:pPr>
-        <w:spacing w:after="140"/>
-      </w:pPr>
+        <w:t xml:space="preserve">Repository name: system-guider</w:t>
+      </w:r>
     </w:p>
     <w:p>
       <w:pPr>
@@ -6984,50 +7406,8 @@
           <w:sz w:val="21"/>
           <w:szCs w:val="21"/>
         </w:rPr>
-        <w:t xml:space="preserve">Initialize git (skip if already done):</w:t>
-      </w:r>
-    </w:p>
-    <w:p>
-      <w:pPr>
-        <w:spacing w:before="100"/>
-      </w:pPr>
-    </w:p>
-    <w:p>
-      <w:pPr>
-        <w:shd w:fill="F8FAFC"/>
-        <w:spacing w:after="0" w:before="0"/>
-        <w:ind w:left="120"/>
-      </w:pPr>
-      <w:r>
-        <w:rPr>
-          <w:rFonts w:ascii="Consolas" w:cs="Consolas" w:eastAsia="Consolas" w:hAnsi="Consolas"/>
-          <w:color w:val="0F172A"/>
-          <w:sz w:val="17"/>
-          <w:szCs w:val="17"/>
-        </w:rPr>
-        <w:t xml:space="preserve">git init</w:t>
-      </w:r>
-    </w:p>
-    <w:p>
-      <w:pPr>
-        <w:shd w:fill="F8FAFC"/>
-        <w:spacing w:after="0" w:before="0"/>
-        <w:ind w:left="120"/>
-      </w:pPr>
-      <w:r>
-        <w:rPr>
-          <w:rFonts w:ascii="Consolas" w:cs="Consolas" w:eastAsia="Consolas" w:hAnsi="Consolas"/>
-          <w:color w:val="0F172A"/>
-          <w:sz w:val="17"/>
-          <w:szCs w:val="17"/>
-        </w:rPr>
-        <w:t xml:space="preserve">git branch -M main</w:t>
-      </w:r>
-    </w:p>
-    <w:p>
-      <w:pPr>
-        <w:spacing w:after="140"/>
-      </w:pPr>
+        <w:t xml:space="preserve">Description (optional): Record and replay interactive UI guides.</w:t>
+      </w:r>
     </w:p>
     <w:p>
       <w:pPr>
@@ -7045,34 +7425,8 @@
           <w:sz w:val="21"/>
           <w:szCs w:val="21"/>
         </w:rPr>
-        <w:t xml:space="preserve">If a nested empty clone folder exists (system-guider\system-guider), remove it first:</w:t>
-      </w:r>
-    </w:p>
-    <w:p>
-      <w:pPr>
-        <w:spacing w:before="100"/>
-      </w:pPr>
-    </w:p>
-    <w:p>
-      <w:pPr>
-        <w:shd w:fill="F8FAFC"/>
-        <w:spacing w:after="0" w:before="0"/>
-        <w:ind w:left="120"/>
-      </w:pPr>
-      <w:r>
-        <w:rPr>
-          <w:rFonts w:ascii="Consolas" w:cs="Consolas" w:eastAsia="Consolas" w:hAnsi="Consolas"/>
-          <w:color w:val="0F172A"/>
-          <w:sz w:val="17"/>
-          <w:szCs w:val="17"/>
-        </w:rPr>
-        <w:t xml:space="preserve">rmdir /s /q system-guider</w:t>
-      </w:r>
-    </w:p>
-    <w:p>
-      <w:pPr>
-        <w:spacing w:after="140"/>
-      </w:pPr>
+        <w:t xml:space="preserve">Choose Public.</w:t>
+      </w:r>
     </w:p>
     <w:p>
       <w:pPr>
@@ -7090,66 +7444,8 @@
           <w:sz w:val="21"/>
           <w:szCs w:val="21"/>
         </w:rPr>
-        <w:t xml:space="preserve">Stage and commit (IMPORTANT — do this before push):</w:t>
-      </w:r>
-    </w:p>
-    <w:p>
-      <w:pPr>
-        <w:spacing w:before="100"/>
-      </w:pPr>
-    </w:p>
-    <w:p>
-      <w:pPr>
-        <w:shd w:fill="F8FAFC"/>
-        <w:spacing w:after="0" w:before="0"/>
-        <w:ind w:left="120"/>
-      </w:pPr>
-      <w:r>
-        <w:rPr>
-          <w:rFonts w:ascii="Consolas" w:cs="Consolas" w:eastAsia="Consolas" w:hAnsi="Consolas"/>
-          <w:color w:val="0F172A"/>
-          <w:sz w:val="17"/>
-          <w:szCs w:val="17"/>
-        </w:rPr>
-        <w:t xml:space="preserve">git add .</w:t>
-      </w:r>
-    </w:p>
-    <w:p>
-      <w:pPr>
-        <w:shd w:fill="F8FAFC"/>
-        <w:spacing w:after="0" w:before="0"/>
-        <w:ind w:left="120"/>
-      </w:pPr>
-      <w:r>
-        <w:rPr>
-          <w:rFonts w:ascii="Consolas" w:cs="Consolas" w:eastAsia="Consolas" w:hAnsi="Consolas"/>
-          <w:color w:val="0F172A"/>
-          <w:sz w:val="17"/>
-          <w:szCs w:val="17"/>
-        </w:rPr>
-        <w:t xml:space="preserve">git status</w:t>
-      </w:r>
-    </w:p>
-    <w:p>
-      <w:pPr>
-        <w:shd w:fill="F8FAFC"/>
-        <w:spacing w:after="0" w:before="0"/>
-        <w:ind w:left="120"/>
-      </w:pPr>
-      <w:r>
-        <w:rPr>
-          <w:rFonts w:ascii="Consolas" w:cs="Consolas" w:eastAsia="Consolas" w:hAnsi="Consolas"/>
-          <w:color w:val="0F172A"/>
-          <w:sz w:val="17"/>
-          <w:szCs w:val="17"/>
-        </w:rPr>
-        <w:t xml:space="preserve">git commit -m "Initial commit: System Guider library"</w:t>
-      </w:r>
-    </w:p>
-    <w:p>
-      <w:pPr>
-        <w:spacing w:after="140"/>
-      </w:pPr>
+        <w:t xml:space="preserve">Leave README / .gitignore / license OFF if the project already has those files locally.</w:t>
+      </w:r>
     </w:p>
     <w:p>
       <w:pPr>
@@ -7167,66 +7463,25 @@
           <w:sz w:val="21"/>
           <w:szCs w:val="21"/>
         </w:rPr>
-        <w:t xml:space="preserve">Add the GitHub remote (use your username/repo):</w:t>
-      </w:r>
-    </w:p>
-    <w:p>
-      <w:pPr>
-        <w:spacing w:before="100"/>
-      </w:pPr>
-    </w:p>
-    <w:p>
-      <w:pPr>
-        <w:shd w:fill="F8FAFC"/>
-        <w:spacing w:after="0" w:before="0"/>
-        <w:ind w:left="120"/>
-      </w:pPr>
-      <w:r>
-        <w:rPr>
-          <w:rFonts w:ascii="Consolas" w:cs="Consolas" w:eastAsia="Consolas" w:hAnsi="Consolas"/>
-          <w:color w:val="0F172A"/>
-          <w:sz w:val="17"/>
-          <w:szCs w:val="17"/>
-        </w:rPr>
-        <w:t xml:space="preserve">git remote add origin https://github.com/jaimarbacs-prog/system-guider.git</w:t>
-      </w:r>
-    </w:p>
-    <w:p>
-      <w:pPr>
-        <w:shd w:fill="F8FAFC"/>
-        <w:spacing w:after="0" w:before="0"/>
-        <w:ind w:left="120"/>
-      </w:pPr>
-      <w:r>
-        <w:rPr>
-          <w:rFonts w:ascii="Consolas" w:cs="Consolas" w:eastAsia="Consolas" w:hAnsi="Consolas"/>
-          <w:color w:val="0F172A"/>
-          <w:sz w:val="17"/>
-          <w:szCs w:val="17"/>
-        </w:rPr>
-        <w:t xml:space="preserve"># If remote already exists:</w:t>
-      </w:r>
-    </w:p>
-    <w:p>
-      <w:pPr>
-        <w:shd w:fill="F8FAFC"/>
-        <w:spacing w:after="0" w:before="0"/>
-        <w:ind w:left="120"/>
-      </w:pPr>
-      <w:r>
-        <w:rPr>
-          <w:rFonts w:ascii="Consolas" w:cs="Consolas" w:eastAsia="Consolas" w:hAnsi="Consolas"/>
-          <w:color w:val="0F172A"/>
-          <w:sz w:val="17"/>
-          <w:szCs w:val="17"/>
-        </w:rPr>
-        <w:t xml:space="preserve"># git remote set-url origin https://github.com/jaimarbacs-prog/system-guider.git</w:t>
-      </w:r>
-    </w:p>
-    <w:p>
-      <w:pPr>
-        <w:spacing w:after="140"/>
-      </w:pPr>
+        <w:t xml:space="preserve">Click Create repository.</w:t>
+      </w:r>
+    </w:p>
+    <w:p>
+      <w:pPr>
+        <w:pStyle w:val="Heading2"/>
+        <w:spacing w:after="100" w:before="280"/>
+      </w:pPr>
+      <w:r>
+        <w:rPr>
+          <w:rFonts w:ascii="Calibri" w:cs="Calibri" w:eastAsia="Calibri" w:hAnsi="Calibri"/>
+          <w:b/>
+          <w:bCs/>
+          <w:color w:val="1D4ED8"/>
+          <w:sz w:val="24"/>
+          <w:szCs w:val="24"/>
+        </w:rPr>
+        <w:t xml:space="preserve">11.3 First-time push from your PC</w:t>
+      </w:r>
     </w:p>
     <w:p>
       <w:pPr>
@@ -7244,6 +7499,391 @@
           <w:sz w:val="21"/>
           <w:szCs w:val="21"/>
         </w:rPr>
+        <w:t xml:space="preserve">Open Command Prompt or PowerShell.</w:t>
+      </w:r>
+    </w:p>
+    <w:p>
+      <w:pPr>
+        <w:pStyle w:val="ListParagraph"/>
+        <w:numPr>
+          <w:ilvl w:val="0"/>
+          <w:numId w:val="3"/>
+        </w:numPr>
+        <w:spacing w:after="56"/>
+      </w:pPr>
+      <w:r>
+        <w:rPr>
+          <w:rFonts w:ascii="Calibri" w:cs="Calibri" w:eastAsia="Calibri" w:hAnsi="Calibri"/>
+          <w:color w:val="0F172A"/>
+          <w:sz w:val="21"/>
+          <w:szCs w:val="21"/>
+        </w:rPr>
+        <w:t xml:space="preserve">Go to the library folder:</w:t>
+      </w:r>
+    </w:p>
+    <w:p>
+      <w:pPr>
+        <w:spacing w:before="100"/>
+      </w:pPr>
+    </w:p>
+    <w:p>
+      <w:pPr>
+        <w:shd w:fill="F8FAFC"/>
+        <w:spacing w:after="0" w:before="0"/>
+        <w:ind w:left="120"/>
+      </w:pPr>
+      <w:r>
+        <w:rPr>
+          <w:rFonts w:ascii="Consolas" w:cs="Consolas" w:eastAsia="Consolas" w:hAnsi="Consolas"/>
+          <w:color w:val="0F172A"/>
+          <w:sz w:val="17"/>
+          <w:szCs w:val="17"/>
+        </w:rPr>
+        <w:t xml:space="preserve">cd C:\path\to\system-guider</w:t>
+      </w:r>
+    </w:p>
+    <w:p>
+      <w:pPr>
+        <w:spacing w:after="140"/>
+      </w:pPr>
+    </w:p>
+    <w:p>
+      <w:pPr>
+        <w:pStyle w:val="ListParagraph"/>
+        <w:numPr>
+          <w:ilvl w:val="0"/>
+          <w:numId w:val="3"/>
+        </w:numPr>
+        <w:spacing w:after="56"/>
+      </w:pPr>
+      <w:r>
+        <w:rPr>
+          <w:rFonts w:ascii="Calibri" w:cs="Calibri" w:eastAsia="Calibri" w:hAnsi="Calibri"/>
+          <w:color w:val="0F172A"/>
+          <w:sz w:val="21"/>
+          <w:szCs w:val="21"/>
+        </w:rPr>
+        <w:t xml:space="preserve">Build before push (so dist/ is ready for consumers):</w:t>
+      </w:r>
+    </w:p>
+    <w:p>
+      <w:pPr>
+        <w:spacing w:before="100"/>
+      </w:pPr>
+    </w:p>
+    <w:p>
+      <w:pPr>
+        <w:shd w:fill="F8FAFC"/>
+        <w:spacing w:after="0" w:before="0"/>
+        <w:ind w:left="120"/>
+      </w:pPr>
+      <w:r>
+        <w:rPr>
+          <w:rFonts w:ascii="Consolas" w:cs="Consolas" w:eastAsia="Consolas" w:hAnsi="Consolas"/>
+          <w:color w:val="0F172A"/>
+          <w:sz w:val="17"/>
+          <w:szCs w:val="17"/>
+        </w:rPr>
+        <w:t xml:space="preserve">npm install</w:t>
+      </w:r>
+    </w:p>
+    <w:p>
+      <w:pPr>
+        <w:shd w:fill="F8FAFC"/>
+        <w:spacing w:after="0" w:before="0"/>
+        <w:ind w:left="120"/>
+      </w:pPr>
+      <w:r>
+        <w:rPr>
+          <w:rFonts w:ascii="Consolas" w:cs="Consolas" w:eastAsia="Consolas" w:hAnsi="Consolas"/>
+          <w:color w:val="0F172A"/>
+          <w:sz w:val="17"/>
+          <w:szCs w:val="17"/>
+        </w:rPr>
+        <w:t xml:space="preserve">npm run build</w:t>
+      </w:r>
+    </w:p>
+    <w:p>
+      <w:pPr>
+        <w:spacing w:after="140"/>
+      </w:pPr>
+    </w:p>
+    <w:p>
+      <w:pPr>
+        <w:pStyle w:val="ListParagraph"/>
+        <w:numPr>
+          <w:ilvl w:val="0"/>
+          <w:numId w:val="3"/>
+        </w:numPr>
+        <w:spacing w:after="56"/>
+      </w:pPr>
+      <w:r>
+        <w:rPr>
+          <w:rFonts w:ascii="Calibri" w:cs="Calibri" w:eastAsia="Calibri" w:hAnsi="Calibri"/>
+          <w:color w:val="0F172A"/>
+          <w:sz w:val="21"/>
+          <w:szCs w:val="21"/>
+        </w:rPr>
+        <w:t xml:space="preserve">Initialize git (skip if already done):</w:t>
+      </w:r>
+    </w:p>
+    <w:p>
+      <w:pPr>
+        <w:spacing w:before="100"/>
+      </w:pPr>
+    </w:p>
+    <w:p>
+      <w:pPr>
+        <w:shd w:fill="F8FAFC"/>
+        <w:spacing w:after="0" w:before="0"/>
+        <w:ind w:left="120"/>
+      </w:pPr>
+      <w:r>
+        <w:rPr>
+          <w:rFonts w:ascii="Consolas" w:cs="Consolas" w:eastAsia="Consolas" w:hAnsi="Consolas"/>
+          <w:color w:val="0F172A"/>
+          <w:sz w:val="17"/>
+          <w:szCs w:val="17"/>
+        </w:rPr>
+        <w:t xml:space="preserve">git init</w:t>
+      </w:r>
+    </w:p>
+    <w:p>
+      <w:pPr>
+        <w:shd w:fill="F8FAFC"/>
+        <w:spacing w:after="0" w:before="0"/>
+        <w:ind w:left="120"/>
+      </w:pPr>
+      <w:r>
+        <w:rPr>
+          <w:rFonts w:ascii="Consolas" w:cs="Consolas" w:eastAsia="Consolas" w:hAnsi="Consolas"/>
+          <w:color w:val="0F172A"/>
+          <w:sz w:val="17"/>
+          <w:szCs w:val="17"/>
+        </w:rPr>
+        <w:t xml:space="preserve">git branch -M main</w:t>
+      </w:r>
+    </w:p>
+    <w:p>
+      <w:pPr>
+        <w:spacing w:after="140"/>
+      </w:pPr>
+    </w:p>
+    <w:p>
+      <w:pPr>
+        <w:pStyle w:val="ListParagraph"/>
+        <w:numPr>
+          <w:ilvl w:val="0"/>
+          <w:numId w:val="3"/>
+        </w:numPr>
+        <w:spacing w:after="56"/>
+      </w:pPr>
+      <w:r>
+        <w:rPr>
+          <w:rFonts w:ascii="Calibri" w:cs="Calibri" w:eastAsia="Calibri" w:hAnsi="Calibri"/>
+          <w:color w:val="0F172A"/>
+          <w:sz w:val="21"/>
+          <w:szCs w:val="21"/>
+        </w:rPr>
+        <w:t xml:space="preserve">If a nested empty clone folder exists (system-guider\system-guider), remove it first:</w:t>
+      </w:r>
+    </w:p>
+    <w:p>
+      <w:pPr>
+        <w:spacing w:before="100"/>
+      </w:pPr>
+    </w:p>
+    <w:p>
+      <w:pPr>
+        <w:shd w:fill="F8FAFC"/>
+        <w:spacing w:after="0" w:before="0"/>
+        <w:ind w:left="120"/>
+      </w:pPr>
+      <w:r>
+        <w:rPr>
+          <w:rFonts w:ascii="Consolas" w:cs="Consolas" w:eastAsia="Consolas" w:hAnsi="Consolas"/>
+          <w:color w:val="0F172A"/>
+          <w:sz w:val="17"/>
+          <w:szCs w:val="17"/>
+        </w:rPr>
+        <w:t xml:space="preserve">rmdir /s /q system-guider</w:t>
+      </w:r>
+    </w:p>
+    <w:p>
+      <w:pPr>
+        <w:spacing w:after="140"/>
+      </w:pPr>
+    </w:p>
+    <w:p>
+      <w:pPr>
+        <w:pStyle w:val="ListParagraph"/>
+        <w:numPr>
+          <w:ilvl w:val="0"/>
+          <w:numId w:val="3"/>
+        </w:numPr>
+        <w:spacing w:after="56"/>
+      </w:pPr>
+      <w:r>
+        <w:rPr>
+          <w:rFonts w:ascii="Calibri" w:cs="Calibri" w:eastAsia="Calibri" w:hAnsi="Calibri"/>
+          <w:color w:val="0F172A"/>
+          <w:sz w:val="21"/>
+          <w:szCs w:val="21"/>
+        </w:rPr>
+        <w:t xml:space="preserve">Stage and commit (IMPORTANT — do this before push):</w:t>
+      </w:r>
+    </w:p>
+    <w:p>
+      <w:pPr>
+        <w:spacing w:before="100"/>
+      </w:pPr>
+    </w:p>
+    <w:p>
+      <w:pPr>
+        <w:shd w:fill="F8FAFC"/>
+        <w:spacing w:after="0" w:before="0"/>
+        <w:ind w:left="120"/>
+      </w:pPr>
+      <w:r>
+        <w:rPr>
+          <w:rFonts w:ascii="Consolas" w:cs="Consolas" w:eastAsia="Consolas" w:hAnsi="Consolas"/>
+          <w:color w:val="0F172A"/>
+          <w:sz w:val="17"/>
+          <w:szCs w:val="17"/>
+        </w:rPr>
+        <w:t xml:space="preserve">git add .</w:t>
+      </w:r>
+    </w:p>
+    <w:p>
+      <w:pPr>
+        <w:shd w:fill="F8FAFC"/>
+        <w:spacing w:after="0" w:before="0"/>
+        <w:ind w:left="120"/>
+      </w:pPr>
+      <w:r>
+        <w:rPr>
+          <w:rFonts w:ascii="Consolas" w:cs="Consolas" w:eastAsia="Consolas" w:hAnsi="Consolas"/>
+          <w:color w:val="0F172A"/>
+          <w:sz w:val="17"/>
+          <w:szCs w:val="17"/>
+        </w:rPr>
+        <w:t xml:space="preserve">git status</w:t>
+      </w:r>
+    </w:p>
+    <w:p>
+      <w:pPr>
+        <w:shd w:fill="F8FAFC"/>
+        <w:spacing w:after="0" w:before="0"/>
+        <w:ind w:left="120"/>
+      </w:pPr>
+      <w:r>
+        <w:rPr>
+          <w:rFonts w:ascii="Consolas" w:cs="Consolas" w:eastAsia="Consolas" w:hAnsi="Consolas"/>
+          <w:color w:val="0F172A"/>
+          <w:sz w:val="17"/>
+          <w:szCs w:val="17"/>
+        </w:rPr>
+        <w:t xml:space="preserve">git commit -m "Initial commit: System Guider library"</w:t>
+      </w:r>
+    </w:p>
+    <w:p>
+      <w:pPr>
+        <w:spacing w:after="140"/>
+      </w:pPr>
+    </w:p>
+    <w:p>
+      <w:pPr>
+        <w:pStyle w:val="ListParagraph"/>
+        <w:numPr>
+          <w:ilvl w:val="0"/>
+          <w:numId w:val="3"/>
+        </w:numPr>
+        <w:spacing w:after="56"/>
+      </w:pPr>
+      <w:r>
+        <w:rPr>
+          <w:rFonts w:ascii="Calibri" w:cs="Calibri" w:eastAsia="Calibri" w:hAnsi="Calibri"/>
+          <w:color w:val="0F172A"/>
+          <w:sz w:val="21"/>
+          <w:szCs w:val="21"/>
+        </w:rPr>
+        <w:t xml:space="preserve">Add the GitHub remote (use your username/repo):</w:t>
+      </w:r>
+    </w:p>
+    <w:p>
+      <w:pPr>
+        <w:spacing w:before="100"/>
+      </w:pPr>
+    </w:p>
+    <w:p>
+      <w:pPr>
+        <w:shd w:fill="F8FAFC"/>
+        <w:spacing w:after="0" w:before="0"/>
+        <w:ind w:left="120"/>
+      </w:pPr>
+      <w:r>
+        <w:rPr>
+          <w:rFonts w:ascii="Consolas" w:cs="Consolas" w:eastAsia="Consolas" w:hAnsi="Consolas"/>
+          <w:color w:val="0F172A"/>
+          <w:sz w:val="17"/>
+          <w:szCs w:val="17"/>
+        </w:rPr>
+        <w:t xml:space="preserve">git remote add origin https://github.com/jaimarbacs-prog/system-guider.git</w:t>
+      </w:r>
+    </w:p>
+    <w:p>
+      <w:pPr>
+        <w:shd w:fill="F8FAFC"/>
+        <w:spacing w:after="0" w:before="0"/>
+        <w:ind w:left="120"/>
+      </w:pPr>
+      <w:r>
+        <w:rPr>
+          <w:rFonts w:ascii="Consolas" w:cs="Consolas" w:eastAsia="Consolas" w:hAnsi="Consolas"/>
+          <w:color w:val="0F172A"/>
+          <w:sz w:val="17"/>
+          <w:szCs w:val="17"/>
+        </w:rPr>
+        <w:t xml:space="preserve"># If remote already exists:</w:t>
+      </w:r>
+    </w:p>
+    <w:p>
+      <w:pPr>
+        <w:shd w:fill="F8FAFC"/>
+        <w:spacing w:after="0" w:before="0"/>
+        <w:ind w:left="120"/>
+      </w:pPr>
+      <w:r>
+        <w:rPr>
+          <w:rFonts w:ascii="Consolas" w:cs="Consolas" w:eastAsia="Consolas" w:hAnsi="Consolas"/>
+          <w:color w:val="0F172A"/>
+          <w:sz w:val="17"/>
+          <w:szCs w:val="17"/>
+        </w:rPr>
+        <w:t xml:space="preserve"># git remote set-url origin https://github.com/jaimarbacs-prog/system-guider.git</w:t>
+      </w:r>
+    </w:p>
+    <w:p>
+      <w:pPr>
+        <w:spacing w:after="140"/>
+      </w:pPr>
+    </w:p>
+    <w:p>
+      <w:pPr>
+        <w:pStyle w:val="ListParagraph"/>
+        <w:numPr>
+          <w:ilvl w:val="0"/>
+          <w:numId w:val="3"/>
+        </w:numPr>
+        <w:spacing w:after="56"/>
+      </w:pPr>
+      <w:r>
+        <w:rPr>
+          <w:rFonts w:ascii="Calibri" w:cs="Calibri" w:eastAsia="Calibri" w:hAnsi="Calibri"/>
+          <w:color w:val="0F172A"/>
+          <w:sz w:val="21"/>
+          <w:szCs w:val="21"/>
+        </w:rPr>
         <w:t xml:space="preserve">Push:</w:t>
       </w:r>
     </w:p>
@@ -7306,7 +7946,7 @@
           <w:sz w:val="24"/>
           <w:szCs w:val="24"/>
         </w:rPr>
-        <w:t xml:space="preserve">11.3 Later updates (you push changes)</w:t>
+        <w:t xml:space="preserve">11.4 Later updates</w:t>
       </w:r>
     </w:p>
     <w:p>
@@ -7392,6 +8032,86 @@
           <w:szCs w:val="17"/>
         </w:rPr>
         <w:t xml:space="preserve">git push</w:t>
+      </w:r>
+    </w:p>
+    <w:p>
+      <w:pPr>
+        <w:shd w:fill="F8FAFC"/>
+        <w:spacing w:after="0" w:before="0"/>
+        <w:ind w:left="120"/>
+      </w:pPr>
+      <w:r>
+        <w:rPr>
+          <w:rFonts w:ascii="Consolas" w:cs="Consolas" w:eastAsia="Consolas" w:hAnsi="Consolas"/>
+          <w:color w:val="0F172A"/>
+          <w:sz w:val="17"/>
+          <w:szCs w:val="17"/>
+        </w:rPr>
+        <w:t xml:space="preserve"> </w:t>
+      </w:r>
+    </w:p>
+    <w:p>
+      <w:pPr>
+        <w:shd w:fill="F8FAFC"/>
+        <w:spacing w:after="0" w:before="0"/>
+        <w:ind w:left="120"/>
+      </w:pPr>
+      <w:r>
+        <w:rPr>
+          <w:rFonts w:ascii="Consolas" w:cs="Consolas" w:eastAsia="Consolas" w:hAnsi="Consolas"/>
+          <w:color w:val="0F172A"/>
+          <w:sz w:val="17"/>
+          <w:szCs w:val="17"/>
+        </w:rPr>
+        <w:t xml:space="preserve"># Bump and publish a new npm version</w:t>
+      </w:r>
+    </w:p>
+    <w:p>
+      <w:pPr>
+        <w:shd w:fill="F8FAFC"/>
+        <w:spacing w:after="0" w:before="0"/>
+        <w:ind w:left="120"/>
+      </w:pPr>
+      <w:r>
+        <w:rPr>
+          <w:rFonts w:ascii="Consolas" w:cs="Consolas" w:eastAsia="Consolas" w:hAnsi="Consolas"/>
+          <w:color w:val="0F172A"/>
+          <w:sz w:val="17"/>
+          <w:szCs w:val="17"/>
+        </w:rPr>
+        <w:t xml:space="preserve">npm version patch</w:t>
+      </w:r>
+    </w:p>
+    <w:p>
+      <w:pPr>
+        <w:shd w:fill="F8FAFC"/>
+        <w:spacing w:after="0" w:before="0"/>
+        <w:ind w:left="120"/>
+      </w:pPr>
+      <w:r>
+        <w:rPr>
+          <w:rFonts w:ascii="Consolas" w:cs="Consolas" w:eastAsia="Consolas" w:hAnsi="Consolas"/>
+          <w:color w:val="0F172A"/>
+          <w:sz w:val="17"/>
+          <w:szCs w:val="17"/>
+        </w:rPr>
+        <w:t xml:space="preserve">npm publish --access public</w:t>
+      </w:r>
+    </w:p>
+    <w:p>
+      <w:pPr>
+        <w:shd w:fill="F8FAFC"/>
+        <w:spacing w:after="0" w:before="0"/>
+        <w:ind w:left="120"/>
+      </w:pPr>
+      <w:r>
+        <w:rPr>
+          <w:rFonts w:ascii="Consolas" w:cs="Consolas" w:eastAsia="Consolas" w:hAnsi="Consolas"/>
+          <w:color w:val="0F172A"/>
+          <w:sz w:val="17"/>
+          <w:szCs w:val="17"/>
+        </w:rPr>
+        <w:t xml:space="preserve">git push --follow-tags</w:t>
       </w:r>
     </w:p>
     <w:p>
@@ -7413,7 +8133,7 @@
           <w:sz w:val="24"/>
           <w:szCs w:val="24"/>
         </w:rPr>
-        <w:t xml:space="preserve">11.4 Optional version tag</w:t>
+        <w:t xml:space="preserve">11.5 Optional version tag (GitHub pin without npm)</w:t>
       </w:r>
     </w:p>
     <w:p>
@@ -7656,23 +8376,23 @@
           <w:sz w:val="17"/>
           <w:szCs w:val="17"/>
         </w:rPr>
-        <w:t xml:space="preserve">  "id": "save-timesheet",</w:t>
-      </w:r>
-    </w:p>
-    <w:p>
-      <w:pPr>
-        <w:shd w:fill="F8FAFC"/>
-        <w:spacing w:after="0" w:before="0"/>
-        <w:ind w:left="120"/>
-      </w:pPr>
-      <w:r>
-        <w:rPr>
-          <w:rFonts w:ascii="Consolas" w:cs="Consolas" w:eastAsia="Consolas" w:hAnsi="Consolas"/>
-          <w:color w:val="0F172A"/>
-          <w:sz w:val="17"/>
-          <w:szCs w:val="17"/>
-        </w:rPr>
-        <w:t xml:space="preserve">  "title": "Save timesheet",</w:t>
+        <w:t xml:space="preserve">  "id": "example-flow",</w:t>
+      </w:r>
+    </w:p>
+    <w:p>
+      <w:pPr>
+        <w:shd w:fill="F8FAFC"/>
+        <w:spacing w:after="0" w:before="0"/>
+        <w:ind w:left="120"/>
+      </w:pPr>
+      <w:r>
+        <w:rPr>
+          <w:rFonts w:ascii="Consolas" w:cs="Consolas" w:eastAsia="Consolas" w:hAnsi="Consolas"/>
+          <w:color w:val="0F172A"/>
+          <w:sz w:val="17"/>
+          <w:szCs w:val="17"/>
+        </w:rPr>
+        <w:t xml:space="preserve">  "title": "Example flow",</w:t>
       </w:r>
     </w:p>
     <w:p>
@@ -7704,7 +8424,7 @@
           <w:sz w:val="17"/>
           <w:szCs w:val="17"/>
         </w:rPr>
-        <w:t xml:space="preserve">  "url": "/attendance",</w:t>
+        <w:t xml:space="preserve">  "url": "/settings",</w:t>
       </w:r>
     </w:p>
     <w:p>
@@ -7768,7 +8488,7 @@
           <w:sz w:val="17"/>
           <w:szCs w:val="17"/>
         </w:rPr>
-        <w:t xml:space="preserve">      "selector": "[data-guider=\"timesheet-date\"]",</w:t>
+        <w:t xml:space="preserve">      "selector": "[data-guider=\"start-date\"]",</w:t>
       </w:r>
     </w:p>
     <w:p>
@@ -7800,7 +8520,7 @@
           <w:sz w:val="17"/>
           <w:szCs w:val="17"/>
         </w:rPr>
-        <w:t xml:space="preserve">        "dataGuider": "timesheet-date",</w:t>
+        <w:t xml:space="preserve">        "dataGuider": "start-date",</w:t>
       </w:r>
     </w:p>
     <w:p>
@@ -7880,23 +8600,23 @@
           <w:sz w:val="17"/>
           <w:szCs w:val="17"/>
         </w:rPr>
-        <w:t xml:space="preserve">      "title": "Choose the date",</w:t>
-      </w:r>
-    </w:p>
-    <w:p>
-      <w:pPr>
-        <w:shd w:fill="F8FAFC"/>
-        <w:spacing w:after="0" w:before="0"/>
-        <w:ind w:left="120"/>
-      </w:pPr>
-      <w:r>
-        <w:rPr>
-          <w:rFonts w:ascii="Consolas" w:cs="Consolas" w:eastAsia="Consolas" w:hAnsi="Consolas"/>
-          <w:color w:val="0F172A"/>
-          <w:sz w:val="17"/>
-          <w:szCs w:val="17"/>
-        </w:rPr>
-        <w:t xml:space="preserve">      "description": "Select the timesheet date.",</w:t>
+        <w:t xml:space="preserve">      "title": "Choose a date",</w:t>
+      </w:r>
+    </w:p>
+    <w:p>
+      <w:pPr>
+        <w:shd w:fill="F8FAFC"/>
+        <w:spacing w:after="0" w:before="0"/>
+        <w:ind w:left="120"/>
+      </w:pPr>
+      <w:r>
+        <w:rPr>
+          <w:rFonts w:ascii="Consolas" w:cs="Consolas" w:eastAsia="Consolas" w:hAnsi="Consolas"/>
+          <w:color w:val="0F172A"/>
+          <w:sz w:val="17"/>
+          <w:szCs w:val="17"/>
+        </w:rPr>
+        <w:t xml:space="preserve">      "description": "Select the date for this record.",</w:t>
       </w:r>
     </w:p>
     <w:p>

</xml_diff>